<commit_message>
se modifica la plantilla persona fisica
</commit_message>
<xml_diff>
--- a/src/main/resources/templates/docgen/4/4.-CONTRATO DE PRESTACIÓN DE SERVICIOS.docx
+++ b/src/main/resources/templates/docgen/4/4.-CONTRATO DE PRESTACIÓN DE SERVICIOS.docx
@@ -168,19 +168,41 @@
           <w:szCs w:val="21"/>
           <w:lang w:eastAsia="en-US"/>
         </w:rPr>
-        <w:t>), REPRESENTADA EN ESTE ACTO POR LA C. MARTHA VERÓNICA BECERRA VALADEZ, Y POR OTRA PARTE POR SU PROPIO DERECHO EL C. LUIS ALFONSO CHALITA KAIM (A QUIEN EN LO SUCESIVO SE LE DENOMINARÁ COMO “</w:t>
+        <w:t xml:space="preserve">), REPRESENTADA EN ESTE ACTO POR LA C. MARTHA VERÓNICA BECERRA VALADEZ, Y POR OTRA PARTE POR SU PROPIO DERECHO EL C. </w:t>
       </w:r>
       <w:r>
         <w:rPr>
           <w:rFonts w:ascii="Avenir Book" w:eastAsia="Times New Roman" w:hAnsi="Avenir Book" w:cs="Times New Roman"/>
           <w:b/>
           <w:bCs/>
-          <w:color w:val="FF0000"/>
-          <w:sz w:val="21"/>
-          <w:szCs w:val="21"/>
-          <w:lang w:eastAsia="en-US"/>
-        </w:rPr>
-        <w:t>{{EL_CLIENTE}}</w:t>
+          <w:color w:val="EE0000"/>
+          <w:sz w:val="21"/>
+          <w:szCs w:val="21"/>
+          <w:lang w:eastAsia="en-US"/>
+        </w:rPr>
+        <w:t>{{CIUDADANO}}</w:t>
+      </w:r>
+      <w:r>
+        <w:rPr>
+          <w:rFonts w:ascii="Avenir Book" w:eastAsia="Times New Roman" w:hAnsi="Avenir Book" w:cs="Times New Roman"/>
+          <w:b/>
+          <w:bCs/>
+          <w:sz w:val="21"/>
+          <w:szCs w:val="21"/>
+          <w:lang w:eastAsia="en-US"/>
+        </w:rPr>
+        <w:t xml:space="preserve"> (A QUIEN EN LO SUCESIVO SE LE DENOMINARÁ COMO “</w:t>
+      </w:r>
+      <w:r>
+        <w:rPr>
+          <w:rFonts w:ascii="Avenir Book" w:eastAsia="Times New Roman" w:hAnsi="Avenir Book" w:cs="Times New Roman"/>
+          <w:b/>
+          <w:bCs/>
+          <w:sz w:val="21"/>
+          <w:szCs w:val="21"/>
+          <w:lang w:eastAsia="en-US"/>
+        </w:rPr>
+        <w:t>EL CLIENTE</w:t>
       </w:r>
       <w:r>
         <w:rPr>
@@ -571,26 +593,43 @@
           <w:szCs w:val="21"/>
           <w:lang w:eastAsia="en-US"/>
         </w:rPr>
-        <w:t xml:space="preserve"> Declara “</w:t>
-      </w:r>
-      <w:r>
-        <w:rPr>
-          <w:rFonts w:ascii="Avenir Book" w:eastAsia="Times New Roman" w:hAnsi="Avenir Book" w:cs="Times New Roman"/>
-          <w:color w:val="FF0000"/>
-          <w:sz w:val="21"/>
-          <w:szCs w:val="21"/>
-          <w:lang w:eastAsia="en-US"/>
-        </w:rPr>
-        <w:t>{{EL_CLIENTE}}</w:t>
-      </w:r>
-      <w:r>
-        <w:rPr>
-          <w:rFonts w:ascii="Avenir Book" w:eastAsia="Times New Roman" w:hAnsi="Avenir Book" w:cs="Times New Roman"/>
-          <w:sz w:val="21"/>
-          <w:szCs w:val="21"/>
-          <w:lang w:eastAsia="en-US"/>
-        </w:rPr>
-        <w:t xml:space="preserve">” por su propio derecho y bajo protesta de decir verdad, que: </w:t>
+        <w:t xml:space="preserve"> </w:t>
+      </w:r>
+      <w:r>
+        <w:rPr>
+          <w:rFonts w:ascii="Avenir Book" w:eastAsia="Times New Roman" w:hAnsi="Avenir Book" w:cs="Times New Roman"/>
+          <w:sz w:val="21"/>
+          <w:szCs w:val="21"/>
+          <w:lang w:eastAsia="en-US"/>
+        </w:rPr>
+        <w:t>Declara “</w:t>
+      </w:r>
+      <w:r>
+        <w:rPr>
+          <w:rFonts w:ascii="Avenir Book" w:eastAsia="Times New Roman" w:hAnsi="Avenir Book" w:cs="Times New Roman"/>
+          <w:sz w:val="21"/>
+          <w:szCs w:val="21"/>
+          <w:lang w:eastAsia="en-US"/>
+        </w:rPr>
+        <w:t>EL CLIENTE</w:t>
+      </w:r>
+      <w:r>
+        <w:rPr>
+          <w:rFonts w:ascii="Avenir Book" w:eastAsia="Times New Roman" w:hAnsi="Avenir Book" w:cs="Times New Roman"/>
+          <w:sz w:val="21"/>
+          <w:szCs w:val="21"/>
+          <w:lang w:eastAsia="en-US"/>
+        </w:rPr>
+        <w:t>” por su pr</w:t>
+      </w:r>
+      <w:r>
+        <w:rPr>
+          <w:rFonts w:ascii="Avenir Book" w:eastAsia="Times New Roman" w:hAnsi="Avenir Book" w:cs="Times New Roman"/>
+          <w:sz w:val="21"/>
+          <w:szCs w:val="21"/>
+          <w:lang w:eastAsia="en-US"/>
+        </w:rPr>
+        <w:t xml:space="preserve">opio derecho y bajo protesta de decir verdad, que: </w:t>
       </w:r>
     </w:p>
     <w:p>
@@ -634,11 +673,12 @@
           <w:rFonts w:ascii="Avenir Book" w:eastAsia="Times New Roman" w:hAnsi="Avenir Book" w:cs="Times New Roman"/>
           <w:b/>
           <w:bCs/>
-          <w:sz w:val="21"/>
-          <w:szCs w:val="21"/>
-          <w:lang w:eastAsia="en-US"/>
-        </w:rPr>
-        <w:t>LUIS ALFONSO CHALITA KAIM</w:t>
+          <w:color w:val="EE0000"/>
+          <w:sz w:val="21"/>
+          <w:szCs w:val="21"/>
+          <w:lang w:eastAsia="en-US"/>
+        </w:rPr>
+        <w:t>{{CIUDADANO}}</w:t>
       </w:r>
       <w:r>
         <w:rPr>
@@ -694,18 +734,99 @@
           <w:szCs w:val="21"/>
           <w:lang w:eastAsia="en-US"/>
         </w:rPr>
-        <w:t xml:space="preserve">Que su CURP es CAKL620315HJCHMS00 y su Registro Federal de Contribuyente (RFC) es </w:t>
+        <w:t xml:space="preserve">Que su CURP es </w:t>
       </w:r>
       <w:r>
         <w:rPr>
           <w:rFonts w:ascii="Avenir Book" w:eastAsia="Times New Roman" w:hAnsi="Avenir Book" w:cs="Times New Roman"/>
           <w:b/>
           <w:bCs/>
-          <w:sz w:val="21"/>
-          <w:szCs w:val="21"/>
-          <w:lang w:eastAsia="en-US"/>
-        </w:rPr>
-        <w:t>CAKL620315IZ1.</w:t>
+          <w:color w:val="EE0000"/>
+          <w:sz w:val="21"/>
+          <w:szCs w:val="21"/>
+          <w:lang w:eastAsia="en-US"/>
+        </w:rPr>
+        <w:t>{{C</w:t>
+      </w:r>
+      <w:r>
+        <w:rPr>
+          <w:rFonts w:ascii="Avenir Book" w:eastAsia="Times New Roman" w:hAnsi="Avenir Book" w:cs="Times New Roman"/>
+          <w:b/>
+          <w:bCs/>
+          <w:color w:val="EE0000"/>
+          <w:sz w:val="21"/>
+          <w:szCs w:val="21"/>
+          <w:lang w:eastAsia="en-US"/>
+        </w:rPr>
+        <w:t>URP</w:t>
+      </w:r>
+      <w:r>
+        <w:rPr>
+          <w:rFonts w:ascii="Avenir Book" w:eastAsia="Times New Roman" w:hAnsi="Avenir Book" w:cs="Times New Roman"/>
+          <w:b/>
+          <w:bCs/>
+          <w:color w:val="EE0000"/>
+          <w:sz w:val="21"/>
+          <w:szCs w:val="21"/>
+          <w:lang w:eastAsia="en-US"/>
+        </w:rPr>
+        <w:t>}}</w:t>
+      </w:r>
+      <w:r>
+        <w:rPr>
+          <w:rFonts w:ascii="Avenir Book" w:eastAsia="Times New Roman" w:hAnsi="Avenir Book" w:cs="Times New Roman"/>
+          <w:sz w:val="21"/>
+          <w:szCs w:val="21"/>
+          <w:lang w:eastAsia="en-US"/>
+        </w:rPr>
+        <w:t xml:space="preserve"> y su Registro Federal de Contribuyente (RFC) es </w:t>
+      </w:r>
+      <w:r>
+        <w:rPr>
+          <w:rFonts w:ascii="Avenir Book" w:eastAsia="Times New Roman" w:hAnsi="Avenir Book" w:cs="Times New Roman"/>
+          <w:b/>
+          <w:bCs/>
+          <w:color w:val="EE0000"/>
+          <w:sz w:val="21"/>
+          <w:szCs w:val="21"/>
+          <w:lang w:eastAsia="en-US"/>
+        </w:rPr>
+        <w:t>{{</w:t>
+      </w:r>
+      <w:r>
+        <w:rPr>
+          <w:rFonts w:ascii="Avenir Book" w:eastAsia="Times New Roman" w:hAnsi="Avenir Book" w:cs="Times New Roman"/>
+          <w:b/>
+          <w:bCs/>
+          <w:color w:val="EE0000"/>
+          <w:sz w:val="21"/>
+          <w:szCs w:val="21"/>
+          <w:lang w:eastAsia="en-US"/>
+        </w:rPr>
+        <w:t>RFC</w:t>
+      </w:r>
+      <w:r>
+        <w:rPr>
+          <w:rFonts w:ascii="Avenir Book" w:eastAsia="Times New Roman" w:hAnsi="Avenir Book" w:cs="Times New Roman"/>
+          <w:b/>
+          <w:bCs/>
+          <w:color w:val="EE0000"/>
+          <w:sz w:val="21"/>
+          <w:szCs w:val="21"/>
+          <w:lang w:eastAsia="en-US"/>
+        </w:rPr>
+        <w:t>}}</w:t>
+      </w:r>
+      <w:r>
+        <w:rPr>
+          <w:rFonts w:ascii="Avenir Book" w:eastAsia="Times New Roman" w:hAnsi="Avenir Book" w:cs="Times New Roman"/>
+          <w:b/>
+          <w:bCs/>
+          <w:sz w:val="21"/>
+          <w:szCs w:val="21"/>
+          <w:lang w:eastAsia="en-US"/>
+        </w:rPr>
+        <w:t>.</w:t>
       </w:r>
     </w:p>
     <w:p>
@@ -730,7 +851,6 @@
         <w:jc w:val="both"/>
         <w:rPr>
           <w:rFonts w:ascii="Avenir Book" w:eastAsia="Times New Roman" w:hAnsi="Avenir Book" w:cs="Times New Roman"/>
-          <w:color w:val="FF0000"/>
           <w:sz w:val="21"/>
           <w:szCs w:val="21"/>
           <w:lang w:eastAsia="en-US"/>
@@ -752,7 +872,6 @@
         <w:jc w:val="both"/>
         <w:rPr>
           <w:rFonts w:ascii="Avenir Book" w:eastAsia="Times New Roman" w:hAnsi="Avenir Book" w:cs="Times New Roman"/>
-          <w:color w:val="FF0000"/>
           <w:sz w:val="21"/>
           <w:szCs w:val="21"/>
           <w:lang w:eastAsia="en-US"/>
@@ -1228,7 +1347,16 @@
           <w:szCs w:val="21"/>
           <w:lang w:eastAsia="en-US"/>
         </w:rPr>
-        <w:t>” se obliga a prestar en favor d</w:t>
+        <w:t xml:space="preserve">” se obliga a prestar en </w:t>
+      </w:r>
+      <w:r>
+        <w:rPr>
+          <w:rFonts w:ascii="Avenir Book" w:eastAsia="Times New Roman" w:hAnsi="Avenir Book" w:cs="Times New Roman"/>
+          <w:sz w:val="21"/>
+          <w:szCs w:val="21"/>
+          <w:lang w:eastAsia="en-US"/>
+        </w:rPr>
+        <w:t>favor d</w:t>
       </w:r>
       <w:r>
         <w:rPr>
@@ -1242,12 +1370,11 @@
       <w:r>
         <w:rPr>
           <w:rFonts w:ascii="Avenir Book" w:eastAsia="Times New Roman" w:hAnsi="Avenir Book" w:cs="Times New Roman"/>
-          <w:color w:val="FF0000"/>
-          <w:sz w:val="21"/>
-          <w:szCs w:val="21"/>
-          <w:lang w:eastAsia="en-US"/>
-        </w:rPr>
-        <w:t>{{EL_CLIENTE}}</w:t>
+          <w:sz w:val="21"/>
+          <w:szCs w:val="21"/>
+          <w:lang w:eastAsia="en-US"/>
+        </w:rPr>
+        <w:t>EL CLIENTE</w:t>
       </w:r>
       <w:r>
         <w:rPr>
@@ -1312,12 +1439,11 @@
       <w:r>
         <w:rPr>
           <w:rFonts w:ascii="Avenir Book" w:eastAsia="Times New Roman" w:hAnsi="Avenir Book" w:cs="Times New Roman"/>
-          <w:color w:val="FF0000"/>
-          <w:sz w:val="21"/>
-          <w:szCs w:val="21"/>
-          <w:lang w:eastAsia="en-US"/>
-        </w:rPr>
-        <w:t>{{EL_CLIENTE}}</w:t>
+          <w:sz w:val="21"/>
+          <w:szCs w:val="21"/>
+          <w:lang w:eastAsia="en-US"/>
+        </w:rPr>
+        <w:t>EL CLIENTE</w:t>
       </w:r>
       <w:r>
         <w:rPr>
@@ -1331,12 +1457,11 @@
       <w:r>
         <w:rPr>
           <w:rFonts w:ascii="Avenir Book" w:eastAsia="Times New Roman" w:hAnsi="Avenir Book" w:cs="Times New Roman"/>
-          <w:color w:val="FF0000"/>
-          <w:sz w:val="21"/>
-          <w:szCs w:val="21"/>
-          <w:lang w:eastAsia="en-US"/>
-        </w:rPr>
-        <w:t>{{EL_CLIENTE}}</w:t>
+          <w:sz w:val="21"/>
+          <w:szCs w:val="21"/>
+          <w:lang w:eastAsia="en-US"/>
+        </w:rPr>
+        <w:t>EL CLIENTE</w:t>
       </w:r>
       <w:r>
         <w:rPr>
@@ -1401,12 +1526,11 @@
       <w:r>
         <w:rPr>
           <w:rFonts w:ascii="Avenir Book" w:eastAsia="Times New Roman" w:hAnsi="Avenir Book" w:cs="Times New Roman"/>
-          <w:color w:val="FF0000"/>
-          <w:sz w:val="21"/>
-          <w:szCs w:val="21"/>
-          <w:lang w:eastAsia="en-US"/>
-        </w:rPr>
-        <w:t>{{EL_CLIENTE}}</w:t>
+          <w:sz w:val="21"/>
+          <w:szCs w:val="21"/>
+          <w:lang w:eastAsia="en-US"/>
+        </w:rPr>
+        <w:t>EL CLIENTE</w:t>
       </w:r>
       <w:r>
         <w:rPr>
@@ -1420,12 +1544,11 @@
       <w:r>
         <w:rPr>
           <w:rFonts w:ascii="Avenir Book" w:eastAsia="Times New Roman" w:hAnsi="Avenir Book" w:cs="Times New Roman"/>
-          <w:color w:val="FF0000"/>
-          <w:sz w:val="21"/>
-          <w:szCs w:val="21"/>
-          <w:lang w:eastAsia="en-US"/>
-        </w:rPr>
-        <w:t>{{EL_CLIENTE}}</w:t>
+          <w:sz w:val="21"/>
+          <w:szCs w:val="21"/>
+          <w:lang w:eastAsia="en-US"/>
+        </w:rPr>
+        <w:t>EL CLIENTE</w:t>
       </w:r>
       <w:r>
         <w:rPr>
@@ -1457,12 +1580,11 @@
       <w:r>
         <w:rPr>
           <w:rFonts w:ascii="Avenir Book" w:eastAsia="Times New Roman" w:hAnsi="Avenir Book" w:cs="Times New Roman"/>
-          <w:color w:val="FF0000"/>
-          <w:sz w:val="21"/>
-          <w:szCs w:val="21"/>
-          <w:lang w:eastAsia="en-US"/>
-        </w:rPr>
-        <w:t>{{EL_CLIENTE}}</w:t>
+          <w:sz w:val="21"/>
+          <w:szCs w:val="21"/>
+          <w:lang w:eastAsia="en-US"/>
+        </w:rPr>
+        <w:t>EL CLIENTE</w:t>
       </w:r>
       <w:r>
         <w:rPr>
@@ -1509,21 +1631,20 @@
       <w:r>
         <w:rPr>
           <w:rFonts w:ascii="Avenir Book" w:eastAsia="Times New Roman" w:hAnsi="Avenir Book" w:cs="Times New Roman"/>
-          <w:color w:val="FF0000"/>
-          <w:sz w:val="21"/>
-          <w:szCs w:val="21"/>
-          <w:lang w:eastAsia="en-US"/>
-        </w:rPr>
-        <w:t>{{EL_CLIENTE}}</w:t>
-      </w:r>
-      <w:r>
-        <w:rPr>
-          <w:rFonts w:ascii="Avenir Book" w:eastAsia="Times New Roman" w:hAnsi="Avenir Book" w:cs="Times New Roman"/>
-          <w:sz w:val="21"/>
-          <w:szCs w:val="21"/>
-          <w:lang w:eastAsia="en-US"/>
-        </w:rPr>
-        <w:t xml:space="preserve">” podrían estar </w:t>
+          <w:sz w:val="21"/>
+          <w:szCs w:val="21"/>
+          <w:lang w:eastAsia="en-US"/>
+        </w:rPr>
+        <w:t>EL CLIENTE</w:t>
+      </w:r>
+      <w:r>
+        <w:rPr>
+          <w:rFonts w:ascii="Avenir Book" w:eastAsia="Times New Roman" w:hAnsi="Avenir Book" w:cs="Times New Roman"/>
+          <w:sz w:val="21"/>
+          <w:szCs w:val="21"/>
+          <w:lang w:eastAsia="en-US"/>
+        </w:rPr>
+        <w:t xml:space="preserve">” podrían estar expuestos </w:t>
       </w:r>
       <w:r>
         <w:rPr>
@@ -1533,7 +1654,7 @@
           <w:lang w:eastAsia="en-US"/>
         </w:rPr>
         <w:lastRenderedPageBreak/>
-        <w:t>expuestos debido a diversos riesgos laborales, así como una propuesta de indemnización convencional. Este conjunto de documentos constituirá una carpeta de dictamen que integrará la información proveniente de la dictaminación, la inspección física, la evaluación médica y la evaluación actuarial.</w:t>
+        <w:t>debido a diversos riesgos laborales, así como una propuesta de indemnización convencional. Este conjunto de documentos constituirá una carpeta de dictamen que integrará la información proveniente de la dictaminación, la inspección física, la evaluación médica y la evaluación actuarial.</w:t>
       </w:r>
     </w:p>
     <w:p>
@@ -1598,12 +1719,11 @@
       <w:r>
         <w:rPr>
           <w:rFonts w:ascii="Avenir Book" w:eastAsia="Times New Roman" w:hAnsi="Avenir Book" w:cs="Times New Roman"/>
-          <w:color w:val="FF0000"/>
-          <w:sz w:val="21"/>
-          <w:szCs w:val="21"/>
-          <w:lang w:eastAsia="en-US"/>
-        </w:rPr>
-        <w:t>{{EL_CLIENTE}}</w:t>
+          <w:sz w:val="21"/>
+          <w:szCs w:val="21"/>
+          <w:lang w:eastAsia="en-US"/>
+        </w:rPr>
+        <w:t>EL CLIENTE</w:t>
       </w:r>
       <w:r>
         <w:rPr>
@@ -1683,12 +1803,11 @@
       <w:r>
         <w:rPr>
           <w:rFonts w:ascii="Avenir Book" w:eastAsia="Times New Roman" w:hAnsi="Avenir Book" w:cs="Times New Roman"/>
-          <w:color w:val="FF0000"/>
-          <w:sz w:val="21"/>
-          <w:szCs w:val="21"/>
-          <w:lang w:eastAsia="en-US"/>
-        </w:rPr>
-        <w:t>{{EL_CLIENTE}}</w:t>
+          <w:sz w:val="21"/>
+          <w:szCs w:val="21"/>
+          <w:lang w:eastAsia="en-US"/>
+        </w:rPr>
+        <w:t>EL CLIENTE</w:t>
       </w:r>
       <w:r>
         <w:rPr>
@@ -1771,12 +1890,11 @@
       <w:r>
         <w:rPr>
           <w:rFonts w:ascii="Avenir Book" w:eastAsia="Times New Roman" w:hAnsi="Avenir Book" w:cs="Times New Roman"/>
-          <w:color w:val="FF0000"/>
-          <w:sz w:val="21"/>
-          <w:szCs w:val="21"/>
-          <w:lang w:eastAsia="en-US"/>
-        </w:rPr>
-        <w:t>{{EL_CLIENTE}}</w:t>
+          <w:sz w:val="21"/>
+          <w:szCs w:val="21"/>
+          <w:lang w:eastAsia="en-US"/>
+        </w:rPr>
+        <w:t>EL CLIENTE</w:t>
       </w:r>
       <w:r>
         <w:rPr>
@@ -1823,12 +1941,11 @@
       <w:r>
         <w:rPr>
           <w:rFonts w:ascii="Avenir Book" w:eastAsia="Times New Roman" w:hAnsi="Avenir Book" w:cs="Times New Roman"/>
-          <w:color w:val="FF0000"/>
-          <w:sz w:val="21"/>
-          <w:szCs w:val="21"/>
-          <w:lang w:eastAsia="en-US"/>
-        </w:rPr>
-        <w:t>{{EL_CLIENTE}}</w:t>
+          <w:sz w:val="21"/>
+          <w:szCs w:val="21"/>
+          <w:lang w:eastAsia="en-US"/>
+        </w:rPr>
+        <w:t>EL CLIENTE</w:t>
       </w:r>
       <w:r>
         <w:rPr>
@@ -1911,12 +2028,11 @@
       <w:r>
         <w:rPr>
           <w:rFonts w:ascii="Avenir Book" w:eastAsia="Times New Roman" w:hAnsi="Avenir Book" w:cs="Times New Roman"/>
-          <w:color w:val="FF0000"/>
-          <w:sz w:val="21"/>
-          <w:szCs w:val="21"/>
-          <w:lang w:eastAsia="en-US"/>
-        </w:rPr>
-        <w:t>{{EL_CLIENTE}}</w:t>
+          <w:sz w:val="21"/>
+          <w:szCs w:val="21"/>
+          <w:lang w:eastAsia="en-US"/>
+        </w:rPr>
+        <w:t>EL CLIENTE</w:t>
       </w:r>
       <w:r>
         <w:rPr>
@@ -2000,12 +2116,11 @@
       <w:r>
         <w:rPr>
           <w:rFonts w:ascii="Avenir Book" w:eastAsia="Times New Roman" w:hAnsi="Avenir Book" w:cs="Times New Roman"/>
-          <w:color w:val="FF0000"/>
-          <w:sz w:val="21"/>
-          <w:szCs w:val="21"/>
-          <w:lang w:eastAsia="en-US"/>
-        </w:rPr>
-        <w:t>{{EL_CLIENTE}}</w:t>
+          <w:sz w:val="21"/>
+          <w:szCs w:val="21"/>
+          <w:lang w:eastAsia="en-US"/>
+        </w:rPr>
+        <w:t>EL CLIENTE</w:t>
       </w:r>
       <w:r>
         <w:rPr>
@@ -2037,12 +2152,11 @@
       <w:r>
         <w:rPr>
           <w:rFonts w:ascii="Avenir Book" w:eastAsia="Times New Roman" w:hAnsi="Avenir Book" w:cs="Times New Roman"/>
-          <w:color w:val="FF0000"/>
-          <w:sz w:val="21"/>
-          <w:szCs w:val="21"/>
-          <w:lang w:eastAsia="en-US"/>
-        </w:rPr>
-        <w:t>{{EL_CLIENTE}}</w:t>
+          <w:sz w:val="21"/>
+          <w:szCs w:val="21"/>
+          <w:lang w:eastAsia="en-US"/>
+        </w:rPr>
+        <w:t>EL CLIENTE</w:t>
       </w:r>
       <w:r>
         <w:rPr>
@@ -2107,12 +2221,11 @@
       <w:r>
         <w:rPr>
           <w:rFonts w:ascii="Avenir Book" w:eastAsia="Times New Roman" w:hAnsi="Avenir Book" w:cs="Times New Roman"/>
-          <w:color w:val="FF0000"/>
-          <w:sz w:val="21"/>
-          <w:szCs w:val="21"/>
-          <w:lang w:eastAsia="en-US"/>
-        </w:rPr>
-        <w:t>{{EL_CLIENTE}}</w:t>
+          <w:sz w:val="21"/>
+          <w:szCs w:val="21"/>
+          <w:lang w:eastAsia="en-US"/>
+        </w:rPr>
+        <w:t>EL CLIENTE</w:t>
       </w:r>
       <w:r>
         <w:rPr>
@@ -2126,12 +2239,11 @@
       <w:r>
         <w:rPr>
           <w:rFonts w:ascii="Avenir Book" w:eastAsia="Times New Roman" w:hAnsi="Avenir Book" w:cs="Times New Roman"/>
-          <w:color w:val="FF0000"/>
-          <w:sz w:val="21"/>
-          <w:szCs w:val="21"/>
-          <w:lang w:eastAsia="en-US"/>
-        </w:rPr>
-        <w:t>{{EL_CLIENTE}}</w:t>
+          <w:sz w:val="21"/>
+          <w:szCs w:val="21"/>
+          <w:lang w:eastAsia="en-US"/>
+        </w:rPr>
+        <w:t>EL CLIENTE</w:t>
       </w:r>
       <w:r>
         <w:rPr>
@@ -2184,21 +2296,29 @@
       <w:r>
         <w:rPr>
           <w:rFonts w:ascii="Avenir Book" w:eastAsia="Times New Roman" w:hAnsi="Avenir Book" w:cs="Times New Roman"/>
-          <w:color w:val="FF0000"/>
-          <w:sz w:val="21"/>
-          <w:szCs w:val="21"/>
-          <w:lang w:eastAsia="en-US"/>
-        </w:rPr>
-        <w:t>{{EL_CLIENTE}}</w:t>
-      </w:r>
-      <w:r>
-        <w:rPr>
-          <w:rFonts w:ascii="Avenir Book" w:eastAsia="Times New Roman" w:hAnsi="Avenir Book" w:cs="Times New Roman"/>
-          <w:sz w:val="21"/>
-          <w:szCs w:val="21"/>
-          <w:lang w:eastAsia="en-US"/>
-        </w:rPr>
-        <w:t xml:space="preserve">”, este último se obliga a cumplir con todos y cada uno de los pagos de honorarios pactados necesarios para solventar dichas obligaciones, los cuales deberán de ser depositados a la cuenta bancaria identificada con el número </w:t>
+          <w:sz w:val="21"/>
+          <w:szCs w:val="21"/>
+          <w:lang w:eastAsia="en-US"/>
+        </w:rPr>
+        <w:t>EL CLIENTE</w:t>
+      </w:r>
+      <w:r>
+        <w:rPr>
+          <w:rFonts w:ascii="Avenir Book" w:eastAsia="Times New Roman" w:hAnsi="Avenir Book" w:cs="Times New Roman"/>
+          <w:sz w:val="21"/>
+          <w:szCs w:val="21"/>
+          <w:lang w:eastAsia="en-US"/>
+        </w:rPr>
+        <w:t>”, este último se obliga a cumplir con todos y cada uno de los pagos de honorarios p</w:t>
+      </w:r>
+      <w:r>
+        <w:rPr>
+          <w:rFonts w:ascii="Avenir Book" w:eastAsia="Times New Roman" w:hAnsi="Avenir Book" w:cs="Times New Roman"/>
+          <w:sz w:val="21"/>
+          <w:szCs w:val="21"/>
+          <w:lang w:eastAsia="en-US"/>
+        </w:rPr>
+        <w:t xml:space="preserve">actados necesarios para solventar dichas obligaciones, los cuales deberán de ser depositados a la cuenta bancaria identificada con el número </w:t>
       </w:r>
       <w:bookmarkStart w:id="0" w:name="_Hlk156556870"/>
       <w:r>
@@ -2317,12 +2437,11 @@
       <w:r>
         <w:rPr>
           <w:rFonts w:ascii="Avenir Book" w:eastAsia="Times New Roman" w:hAnsi="Avenir Book" w:cs="Times New Roman"/>
-          <w:color w:val="FF0000"/>
-          <w:sz w:val="21"/>
-          <w:szCs w:val="21"/>
-          <w:lang w:eastAsia="en-US"/>
-        </w:rPr>
-        <w:t>{{EL_CLIENTE}}</w:t>
+          <w:sz w:val="21"/>
+          <w:szCs w:val="21"/>
+          <w:lang w:eastAsia="en-US"/>
+        </w:rPr>
+        <w:t>EL CLIENTE</w:t>
       </w:r>
       <w:r>
         <w:rPr>
@@ -2336,12 +2455,11 @@
       <w:r>
         <w:rPr>
           <w:rFonts w:ascii="Avenir Book" w:eastAsia="Times New Roman" w:hAnsi="Avenir Book" w:cs="Times New Roman"/>
-          <w:color w:val="FF0000"/>
-          <w:sz w:val="21"/>
-          <w:szCs w:val="21"/>
-          <w:lang w:eastAsia="en-US"/>
-        </w:rPr>
-        <w:t>{{EL_CLIENTE}}</w:t>
+          <w:sz w:val="21"/>
+          <w:szCs w:val="21"/>
+          <w:lang w:eastAsia="en-US"/>
+        </w:rPr>
+        <w:t>EL CLIENTE</w:t>
       </w:r>
       <w:r>
         <w:rPr>
@@ -2424,21 +2542,40 @@
       <w:r>
         <w:rPr>
           <w:rFonts w:ascii="Avenir Book" w:eastAsia="Times New Roman" w:hAnsi="Avenir Book" w:cs="Times New Roman"/>
-          <w:color w:val="FF0000"/>
-          <w:sz w:val="21"/>
-          <w:szCs w:val="21"/>
-          <w:lang w:eastAsia="en-US"/>
-        </w:rPr>
-        <w:t>{{EL_CLIENTE}}</w:t>
-      </w:r>
-      <w:r>
-        <w:rPr>
-          <w:rFonts w:ascii="Avenir Book" w:eastAsia="Times New Roman" w:hAnsi="Avenir Book" w:cs="Times New Roman"/>
-          <w:sz w:val="21"/>
-          <w:szCs w:val="21"/>
-          <w:lang w:eastAsia="en-US"/>
-        </w:rPr>
-        <w:t>” trabajadores propios, ya que todas las actividades que resulten necesarias para la debida prestación de los servicios contratados, se realizaran en el domicilio de “</w:t>
+          <w:sz w:val="21"/>
+          <w:szCs w:val="21"/>
+          <w:lang w:eastAsia="en-US"/>
+        </w:rPr>
+        <w:t>EL CLIENTE</w:t>
+      </w:r>
+      <w:r>
+        <w:rPr>
+          <w:rFonts w:ascii="Avenir Book" w:eastAsia="Times New Roman" w:hAnsi="Avenir Book" w:cs="Times New Roman"/>
+          <w:sz w:val="21"/>
+          <w:szCs w:val="21"/>
+          <w:lang w:eastAsia="en-US"/>
+        </w:rPr>
+        <w:t xml:space="preserve">” trabajadores propios, ya que todas las actividades que resulten necesarias para la debida prestación de los servicios </w:t>
+      </w:r>
+      <w:proofErr w:type="gramStart"/>
+      <w:r>
+        <w:rPr>
+          <w:rFonts w:ascii="Avenir Book" w:eastAsia="Times New Roman" w:hAnsi="Avenir Book" w:cs="Times New Roman"/>
+          <w:sz w:val="21"/>
+          <w:szCs w:val="21"/>
+          <w:lang w:eastAsia="en-US"/>
+        </w:rPr>
+        <w:t>contratados,</w:t>
+      </w:r>
+      <w:proofErr w:type="gramEnd"/>
+      <w:r>
+        <w:rPr>
+          <w:rFonts w:ascii="Avenir Book" w:eastAsia="Times New Roman" w:hAnsi="Avenir Book" w:cs="Times New Roman"/>
+          <w:sz w:val="21"/>
+          <w:szCs w:val="21"/>
+          <w:lang w:eastAsia="en-US"/>
+        </w:rPr>
+        <w:t xml:space="preserve"> se realizaran en el domicilio de “</w:t>
       </w:r>
       <w:r>
         <w:rPr>
@@ -2673,12 +2810,11 @@
       <w:r>
         <w:rPr>
           <w:rFonts w:ascii="Avenir Book" w:eastAsia="Times New Roman" w:hAnsi="Avenir Book" w:cs="Times New Roman"/>
-          <w:color w:val="FF0000"/>
-          <w:sz w:val="21"/>
-          <w:szCs w:val="21"/>
-          <w:lang w:eastAsia="en-US"/>
-        </w:rPr>
-        <w:t>{{EL_CLIENTE}}</w:t>
+          <w:sz w:val="21"/>
+          <w:szCs w:val="21"/>
+          <w:lang w:eastAsia="en-US"/>
+        </w:rPr>
+        <w:t>EL CLIENTE</w:t>
       </w:r>
       <w:r>
         <w:rPr>
@@ -2839,12 +2975,11 @@
       <w:r>
         <w:rPr>
           <w:rFonts w:ascii="Avenir Book" w:eastAsia="Times New Roman" w:hAnsi="Avenir Book" w:cs="Times New Roman"/>
-          <w:color w:val="FF0000"/>
-          <w:sz w:val="21"/>
-          <w:szCs w:val="21"/>
-          <w:lang w:eastAsia="en-US"/>
-        </w:rPr>
-        <w:t>{{EL_CLIENTE}}</w:t>
+          <w:sz w:val="21"/>
+          <w:szCs w:val="21"/>
+          <w:lang w:eastAsia="en-US"/>
+        </w:rPr>
+        <w:t>EL CLIENTE</w:t>
       </w:r>
       <w:r>
         <w:rPr>
@@ -3091,12 +3226,11 @@
       <w:r>
         <w:rPr>
           <w:rFonts w:ascii="Avenir Book" w:eastAsia="Times New Roman" w:hAnsi="Avenir Book" w:cs="Times New Roman"/>
-          <w:color w:val="FF0000"/>
-          <w:sz w:val="21"/>
-          <w:szCs w:val="21"/>
-          <w:lang w:eastAsia="en-US"/>
-        </w:rPr>
-        <w:t>{{EL_CLIENTE}}</w:t>
+          <w:sz w:val="21"/>
+          <w:szCs w:val="21"/>
+          <w:lang w:eastAsia="en-US"/>
+        </w:rPr>
+        <w:t>EL CLIENTE</w:t>
       </w:r>
       <w:r>
         <w:rPr>
@@ -3163,12 +3297,11 @@
       <w:r>
         <w:rPr>
           <w:rFonts w:ascii="Avenir Book" w:eastAsia="Times New Roman" w:hAnsi="Avenir Book" w:cs="Times New Roman"/>
-          <w:color w:val="FF0000"/>
-          <w:sz w:val="21"/>
-          <w:szCs w:val="21"/>
-          <w:lang w:eastAsia="en-US"/>
-        </w:rPr>
-        <w:t>{{EL_CLIENTE}}</w:t>
+          <w:sz w:val="21"/>
+          <w:szCs w:val="21"/>
+          <w:lang w:eastAsia="en-US"/>
+        </w:rPr>
+        <w:t>EL CLIENTE</w:t>
       </w:r>
       <w:r>
         <w:rPr>
@@ -3221,12 +3354,11 @@
       <w:r>
         <w:rPr>
           <w:rFonts w:ascii="Avenir Book" w:eastAsia="Times New Roman" w:hAnsi="Avenir Book" w:cs="Times New Roman"/>
-          <w:color w:val="FF0000"/>
-          <w:sz w:val="21"/>
-          <w:szCs w:val="21"/>
-          <w:lang w:eastAsia="en-US"/>
-        </w:rPr>
-        <w:t>{{EL_CLIENTE}}</w:t>
+          <w:sz w:val="21"/>
+          <w:szCs w:val="21"/>
+          <w:lang w:eastAsia="en-US"/>
+        </w:rPr>
+        <w:t>EL CLIENTE</w:t>
       </w:r>
       <w:r>
         <w:rPr>
@@ -3293,12 +3425,11 @@
       <w:r>
         <w:rPr>
           <w:rFonts w:ascii="Avenir Book" w:eastAsia="Times New Roman" w:hAnsi="Avenir Book" w:cs="Times New Roman"/>
-          <w:color w:val="FF0000"/>
-          <w:sz w:val="21"/>
-          <w:szCs w:val="21"/>
-          <w:lang w:eastAsia="en-US"/>
-        </w:rPr>
-        <w:t>{{EL_CLIENTE}}</w:t>
+          <w:sz w:val="21"/>
+          <w:szCs w:val="21"/>
+          <w:lang w:eastAsia="en-US"/>
+        </w:rPr>
+        <w:t>EL CLIENTE</w:t>
       </w:r>
       <w:r>
         <w:rPr>
@@ -3411,12 +3542,11 @@
       <w:r>
         <w:rPr>
           <w:rFonts w:ascii="Avenir Book" w:eastAsia="Times New Roman" w:hAnsi="Avenir Book" w:cs="Times New Roman"/>
-          <w:color w:val="FF0000"/>
-          <w:sz w:val="21"/>
-          <w:szCs w:val="21"/>
-          <w:lang w:eastAsia="en-US"/>
-        </w:rPr>
-        <w:t>{{EL_CLIENTE}}</w:t>
+          <w:sz w:val="21"/>
+          <w:szCs w:val="21"/>
+          <w:lang w:eastAsia="en-US"/>
+        </w:rPr>
+        <w:t>EL CLIENTE</w:t>
       </w:r>
       <w:r>
         <w:rPr>
@@ -3468,12 +3598,11 @@
       <w:r>
         <w:rPr>
           <w:rFonts w:ascii="Avenir Book" w:eastAsia="Times New Roman" w:hAnsi="Avenir Book" w:cs="Times New Roman"/>
-          <w:color w:val="FF0000"/>
-          <w:sz w:val="21"/>
-          <w:szCs w:val="21"/>
-          <w:lang w:eastAsia="en-US"/>
-        </w:rPr>
-        <w:t>{{EL_CLIENTE}}</w:t>
+          <w:sz w:val="21"/>
+          <w:szCs w:val="21"/>
+          <w:lang w:eastAsia="en-US"/>
+        </w:rPr>
+        <w:t>EL CLIENTE</w:t>
       </w:r>
       <w:r>
         <w:rPr>
@@ -3520,12 +3649,11 @@
       <w:r>
         <w:rPr>
           <w:rFonts w:ascii="Avenir Book" w:eastAsia="Times New Roman" w:hAnsi="Avenir Book" w:cs="Times New Roman"/>
-          <w:color w:val="FF0000"/>
-          <w:sz w:val="21"/>
-          <w:szCs w:val="21"/>
-          <w:lang w:eastAsia="en-US"/>
-        </w:rPr>
-        <w:t>{{EL_CLIENTE}}</w:t>
+          <w:sz w:val="21"/>
+          <w:szCs w:val="21"/>
+          <w:lang w:eastAsia="en-US"/>
+        </w:rPr>
+        <w:t>EL CLIENTE</w:t>
       </w:r>
       <w:r>
         <w:rPr>
@@ -3552,7 +3680,7 @@
           <w:szCs w:val="21"/>
           <w:lang w:eastAsia="en-US"/>
         </w:rPr>
-        <w:t xml:space="preserve">”, o en su defecto, podrán efectuarse mediante cheque nominativo </w:t>
+        <w:t xml:space="preserve">”, o en su defecto, podrán efectuarse mediante cheque nominativo para </w:t>
       </w:r>
       <w:r>
         <w:rPr>
@@ -3562,17 +3690,16 @@
           <w:lang w:eastAsia="en-US"/>
         </w:rPr>
         <w:lastRenderedPageBreak/>
-        <w:t>para abono en cuenta del beneficiario, el cual, deberá de ser entregado por “</w:t>
-      </w:r>
-      <w:r>
-        <w:rPr>
-          <w:rFonts w:ascii="Avenir Book" w:eastAsia="Times New Roman" w:hAnsi="Avenir Book" w:cs="Times New Roman"/>
-          <w:color w:val="FF0000"/>
-          <w:sz w:val="21"/>
-          <w:szCs w:val="21"/>
-          <w:lang w:eastAsia="en-US"/>
-        </w:rPr>
-        <w:t>{{EL_CLIENTE}}</w:t>
+        <w:t>abono en cuenta del beneficiario, el cual, deberá de ser entregado por “</w:t>
+      </w:r>
+      <w:r>
+        <w:rPr>
+          <w:rFonts w:ascii="Avenir Book" w:eastAsia="Times New Roman" w:hAnsi="Avenir Book" w:cs="Times New Roman"/>
+          <w:sz w:val="21"/>
+          <w:szCs w:val="21"/>
+          <w:lang w:eastAsia="en-US"/>
+        </w:rPr>
+        <w:t>EL CLIENTE</w:t>
       </w:r>
       <w:r>
         <w:rPr>
@@ -3706,21 +3833,40 @@
       <w:r>
         <w:rPr>
           <w:rFonts w:ascii="Avenir Book" w:eastAsia="Times New Roman" w:hAnsi="Avenir Book" w:cs="Times New Roman"/>
-          <w:color w:val="FF0000"/>
-          <w:sz w:val="21"/>
-          <w:szCs w:val="21"/>
-          <w:lang w:eastAsia="en-US"/>
-        </w:rPr>
-        <w:t>{{EL_CLIENTE}}</w:t>
-      </w:r>
-      <w:r>
-        <w:rPr>
-          <w:rFonts w:ascii="Avenir Book" w:eastAsia="Times New Roman" w:hAnsi="Avenir Book" w:cs="Times New Roman"/>
-          <w:sz w:val="21"/>
-          <w:szCs w:val="21"/>
-          <w:lang w:eastAsia="en-US"/>
-        </w:rPr>
-        <w:t>” siendo este último el responsable de los mismos de manera directa frente al sindicato en caso de ser una obligación ante el mismo o frente a los trabajadores en caso de reclamo.</w:t>
+          <w:sz w:val="21"/>
+          <w:szCs w:val="21"/>
+          <w:lang w:eastAsia="en-US"/>
+        </w:rPr>
+        <w:t>EL CLIENTE</w:t>
+      </w:r>
+      <w:r>
+        <w:rPr>
+          <w:rFonts w:ascii="Avenir Book" w:eastAsia="Times New Roman" w:hAnsi="Avenir Book" w:cs="Times New Roman"/>
+          <w:sz w:val="21"/>
+          <w:szCs w:val="21"/>
+          <w:lang w:eastAsia="en-US"/>
+        </w:rPr>
+        <w:t xml:space="preserve">” siendo este último el responsable de </w:t>
+      </w:r>
+      <w:proofErr w:type="gramStart"/>
+      <w:r>
+        <w:rPr>
+          <w:rFonts w:ascii="Avenir Book" w:eastAsia="Times New Roman" w:hAnsi="Avenir Book" w:cs="Times New Roman"/>
+          <w:sz w:val="21"/>
+          <w:szCs w:val="21"/>
+          <w:lang w:eastAsia="en-US"/>
+        </w:rPr>
+        <w:t>los mismos</w:t>
+      </w:r>
+      <w:proofErr w:type="gramEnd"/>
+      <w:r>
+        <w:rPr>
+          <w:rFonts w:ascii="Avenir Book" w:eastAsia="Times New Roman" w:hAnsi="Avenir Book" w:cs="Times New Roman"/>
+          <w:sz w:val="21"/>
+          <w:szCs w:val="21"/>
+          <w:lang w:eastAsia="en-US"/>
+        </w:rPr>
+        <w:t xml:space="preserve"> de manera directa frente al sindicato en caso de ser una obligación ante el mismo o frente a los trabajadores en caso de reclamo.</w:t>
       </w:r>
     </w:p>
     <w:p>
@@ -3846,12 +3992,11 @@
       <w:r>
         <w:rPr>
           <w:rFonts w:ascii="Avenir Book" w:eastAsia="Times New Roman" w:hAnsi="Avenir Book" w:cs="Times New Roman"/>
-          <w:color w:val="FF0000"/>
-          <w:sz w:val="21"/>
-          <w:szCs w:val="21"/>
-          <w:lang w:eastAsia="en-US"/>
-        </w:rPr>
-        <w:t>{{EL_CLIENTE}}</w:t>
+          <w:sz w:val="21"/>
+          <w:szCs w:val="21"/>
+          <w:lang w:eastAsia="en-US"/>
+        </w:rPr>
+        <w:t>EL CLIENTE</w:t>
       </w:r>
       <w:r>
         <w:rPr>
@@ -3952,12 +4097,11 @@
       <w:r>
         <w:rPr>
           <w:rFonts w:ascii="Avenir Book" w:eastAsia="Times New Roman" w:hAnsi="Avenir Book" w:cs="Times New Roman"/>
-          <w:color w:val="FF0000"/>
-          <w:sz w:val="21"/>
-          <w:szCs w:val="21"/>
-          <w:lang w:eastAsia="en-US"/>
-        </w:rPr>
-        <w:t>{{EL_CLIENTE}}</w:t>
+          <w:sz w:val="21"/>
+          <w:szCs w:val="21"/>
+          <w:lang w:eastAsia="en-US"/>
+        </w:rPr>
+        <w:t>EL CLIENTE</w:t>
       </w:r>
       <w:r>
         <w:rPr>
@@ -4004,12 +4148,11 @@
       <w:r>
         <w:rPr>
           <w:rFonts w:ascii="Avenir Book" w:eastAsia="Times New Roman" w:hAnsi="Avenir Book" w:cs="Times New Roman"/>
-          <w:color w:val="FF0000"/>
-          <w:sz w:val="21"/>
-          <w:szCs w:val="21"/>
-          <w:lang w:eastAsia="en-US"/>
-        </w:rPr>
-        <w:t>{{EL_CLIENTE}}</w:t>
+          <w:sz w:val="21"/>
+          <w:szCs w:val="21"/>
+          <w:lang w:eastAsia="en-US"/>
+        </w:rPr>
+        <w:t>EL CLIENTE</w:t>
       </w:r>
       <w:r>
         <w:rPr>
@@ -4059,12 +4202,11 @@
       <w:r>
         <w:rPr>
           <w:rFonts w:ascii="Avenir Book" w:eastAsia="Times New Roman" w:hAnsi="Avenir Book" w:cs="Times New Roman"/>
-          <w:color w:val="FF0000"/>
-          <w:sz w:val="21"/>
-          <w:szCs w:val="21"/>
-          <w:lang w:eastAsia="en-US"/>
-        </w:rPr>
-        <w:t>{{EL_CLIENTE}}</w:t>
+          <w:sz w:val="21"/>
+          <w:szCs w:val="21"/>
+          <w:lang w:eastAsia="en-US"/>
+        </w:rPr>
+        <w:t>EL CLIENTE</w:t>
       </w:r>
       <w:r>
         <w:rPr>
@@ -4096,12 +4238,11 @@
       <w:r>
         <w:rPr>
           <w:rFonts w:ascii="Avenir Book" w:eastAsia="Times New Roman" w:hAnsi="Avenir Book" w:cs="Times New Roman"/>
-          <w:color w:val="FF0000"/>
-          <w:sz w:val="21"/>
-          <w:szCs w:val="21"/>
-          <w:lang w:eastAsia="en-US"/>
-        </w:rPr>
-        <w:t>{{EL_CLIENTE}}</w:t>
+          <w:sz w:val="21"/>
+          <w:szCs w:val="21"/>
+          <w:lang w:eastAsia="en-US"/>
+        </w:rPr>
+        <w:t>EL CLIENTE</w:t>
       </w:r>
       <w:r>
         <w:rPr>
@@ -4202,12 +4343,11 @@
       <w:r>
         <w:rPr>
           <w:rFonts w:ascii="Avenir Book" w:eastAsia="Times New Roman" w:hAnsi="Avenir Book" w:cs="Times New Roman"/>
-          <w:color w:val="FF0000"/>
-          <w:sz w:val="21"/>
-          <w:szCs w:val="21"/>
-          <w:lang w:eastAsia="en-US"/>
-        </w:rPr>
-        <w:t>{{EL_CLIENTE}}</w:t>
+          <w:sz w:val="21"/>
+          <w:szCs w:val="21"/>
+          <w:lang w:eastAsia="en-US"/>
+        </w:rPr>
+        <w:t>EL CLIENTE</w:t>
       </w:r>
       <w:r>
         <w:rPr>
@@ -4351,21 +4491,984 @@
       <w:r>
         <w:rPr>
           <w:rFonts w:ascii="Avenir Book" w:eastAsia="Times New Roman" w:hAnsi="Avenir Book" w:cs="Times New Roman"/>
+          <w:sz w:val="21"/>
+          <w:szCs w:val="21"/>
+          <w:lang w:eastAsia="en-US"/>
+        </w:rPr>
+        <w:t>EL CLIENTE</w:t>
+      </w:r>
+      <w:r>
+        <w:rPr>
+          <w:rFonts w:ascii="Avenir Book" w:eastAsia="Times New Roman" w:hAnsi="Avenir Book" w:cs="Times New Roman"/>
+          <w:sz w:val="21"/>
+          <w:szCs w:val="21"/>
+          <w:lang w:eastAsia="en-US"/>
+        </w:rPr>
+        <w:t>” pueda utilizar los servicios de administración de recursos tendientes al pago de compensaciones y/o indemnizaciones, el “</w:t>
+      </w:r>
+      <w:r>
+        <w:rPr>
+          <w:rFonts w:ascii="Avenir Book" w:eastAsia="Times New Roman" w:hAnsi="Avenir Book" w:cs="Times New Roman"/>
+          <w:sz w:val="21"/>
+          <w:szCs w:val="21"/>
+          <w:lang w:eastAsia="en-US"/>
+        </w:rPr>
+        <w:t>EL PRESTADOR DE SERVICIOS</w:t>
+      </w:r>
+      <w:r>
+        <w:rPr>
+          <w:rFonts w:ascii="Avenir Book" w:eastAsia="Times New Roman" w:hAnsi="Avenir Book" w:cs="Times New Roman"/>
+          <w:sz w:val="21"/>
+          <w:szCs w:val="21"/>
+          <w:lang w:eastAsia="en-US"/>
+        </w:rPr>
+        <w:t xml:space="preserve">” deberá tener celebrado un contrato colectivo de trabajo con el sindicato de su elección, en el cual haya convenido indemnizar a los trabajadores en caso de incumplimiento a las NOMS señaladas con anterioridad en el presente Contrato, medina una cuantificación extrajudicial derivada de un cálculo actuarial realizado por perito. </w:t>
+      </w:r>
+    </w:p>
+    <w:p>
+      <w:pPr>
+        <w:spacing w:after="0" w:line="240" w:lineRule="auto"/>
+        <w:jc w:val="both"/>
+        <w:rPr>
+          <w:rFonts w:ascii="Avenir Book" w:eastAsia="Times New Roman" w:hAnsi="Avenir Book" w:cs="Times New Roman"/>
+          <w:sz w:val="21"/>
+          <w:szCs w:val="21"/>
+          <w:lang w:eastAsia="en-US"/>
+        </w:rPr>
+      </w:pPr>
+    </w:p>
+    <w:p>
+      <w:pPr>
+        <w:spacing w:after="0" w:line="240" w:lineRule="auto"/>
+        <w:jc w:val="both"/>
+        <w:rPr>
+          <w:rFonts w:ascii="Avenir Book" w:eastAsia="Times New Roman" w:hAnsi="Avenir Book" w:cs="Times New Roman"/>
+          <w:sz w:val="21"/>
+          <w:szCs w:val="21"/>
+          <w:lang w:eastAsia="en-US"/>
+        </w:rPr>
+      </w:pPr>
+      <w:r>
+        <w:rPr>
+          <w:rFonts w:ascii="Avenir Book" w:eastAsia="Times New Roman" w:hAnsi="Avenir Book" w:cs="Times New Roman"/>
+          <w:sz w:val="21"/>
+          <w:szCs w:val="21"/>
+          <w:lang w:eastAsia="en-US"/>
+        </w:rPr>
+        <w:t xml:space="preserve">Asimismo, en dicho contrato deberá estar prevista la obligación de compensar y/o indemnizar a los trabajadores en caso de que exista y persista algún elemento que, conforme a los Normas Oficiales Mexicanas en materia de Salud en el Trabajo, generen o puedan generar un detrimento en la salud de los empleados de manera continuada, designando para la evaluación y administración de los recursos destinados a ellos a </w:t>
+      </w:r>
+      <w:proofErr w:type="spellStart"/>
+      <w:r>
+        <w:rPr>
+          <w:rFonts w:ascii="Avenir Book" w:eastAsia="Times New Roman" w:hAnsi="Avenir Book" w:cs="Times New Roman"/>
+          <w:sz w:val="21"/>
+          <w:szCs w:val="21"/>
+          <w:lang w:eastAsia="en-US"/>
+        </w:rPr>
+        <w:t>el</w:t>
+      </w:r>
+      <w:proofErr w:type="spellEnd"/>
+      <w:r>
+        <w:rPr>
+          <w:rFonts w:ascii="Avenir Book" w:eastAsia="Times New Roman" w:hAnsi="Avenir Book" w:cs="Times New Roman"/>
+          <w:sz w:val="21"/>
+          <w:szCs w:val="21"/>
+          <w:lang w:eastAsia="en-US"/>
+        </w:rPr>
+        <w:t xml:space="preserve"> “</w:t>
+      </w:r>
+      <w:r>
+        <w:rPr>
+          <w:rFonts w:ascii="Avenir Book" w:eastAsia="Times New Roman" w:hAnsi="Avenir Book" w:cs="Times New Roman"/>
+          <w:sz w:val="21"/>
+          <w:szCs w:val="21"/>
+          <w:lang w:eastAsia="en-US"/>
+        </w:rPr>
+        <w:t>EL PRESTADOR DE SERVICIOS</w:t>
+      </w:r>
+      <w:r>
+        <w:rPr>
+          <w:rFonts w:ascii="Avenir Book" w:eastAsia="Times New Roman" w:hAnsi="Avenir Book" w:cs="Times New Roman"/>
+          <w:sz w:val="21"/>
+          <w:szCs w:val="21"/>
+          <w:lang w:eastAsia="en-US"/>
+        </w:rPr>
+        <w:t>” y/o a quien este último designe para tales efectos.</w:t>
+      </w:r>
+    </w:p>
+    <w:p>
+      <w:pPr>
+        <w:spacing w:after="0" w:line="240" w:lineRule="auto"/>
+        <w:jc w:val="both"/>
+        <w:rPr>
+          <w:rFonts w:ascii="Avenir Book" w:eastAsia="Times New Roman" w:hAnsi="Avenir Book" w:cs="Times New Roman"/>
+          <w:sz w:val="21"/>
+          <w:szCs w:val="21"/>
+          <w:lang w:eastAsia="en-US"/>
+        </w:rPr>
+      </w:pPr>
+    </w:p>
+    <w:p>
+      <w:pPr>
+        <w:spacing w:after="0" w:line="240" w:lineRule="auto"/>
+        <w:jc w:val="both"/>
+        <w:rPr>
+          <w:rFonts w:ascii="Avenir Book" w:eastAsia="Times New Roman" w:hAnsi="Avenir Book" w:cs="Times New Roman"/>
+          <w:sz w:val="21"/>
+          <w:szCs w:val="21"/>
+          <w:lang w:eastAsia="en-US"/>
+        </w:rPr>
+      </w:pPr>
+      <w:r>
+        <w:rPr>
+          <w:rFonts w:ascii="Avenir Book" w:eastAsia="Times New Roman" w:hAnsi="Avenir Book" w:cs="Times New Roman"/>
+          <w:sz w:val="21"/>
+          <w:szCs w:val="21"/>
+          <w:lang w:eastAsia="en-US"/>
+        </w:rPr>
+        <w:t>Al efecto, las partes están de acuerdo en acordar de manera conjunta con el sindicato la redacción de dicha cláusula, de manera que exista un equilibrio adecuado entre el patrón, sindicato y trabajadores, en lo que se logra la completa regularización de “</w:t>
+      </w:r>
+      <w:r>
+        <w:rPr>
+          <w:rFonts w:ascii="Avenir Book" w:eastAsia="Times New Roman" w:hAnsi="Avenir Book" w:cs="Times New Roman"/>
+          <w:sz w:val="21"/>
+          <w:szCs w:val="21"/>
+          <w:lang w:eastAsia="en-US"/>
+        </w:rPr>
+        <w:t>EL CLIENTE</w:t>
+      </w:r>
+      <w:r>
+        <w:rPr>
+          <w:rFonts w:ascii="Avenir Book" w:eastAsia="Times New Roman" w:hAnsi="Avenir Book" w:cs="Times New Roman"/>
+          <w:sz w:val="21"/>
+          <w:szCs w:val="21"/>
+          <w:lang w:eastAsia="en-US"/>
+        </w:rPr>
+        <w:t>” a los requerimientos de las Normas Oficiales Mexicanas multicitadas.</w:t>
+      </w:r>
+    </w:p>
+    <w:p>
+      <w:pPr>
+        <w:spacing w:after="0" w:line="240" w:lineRule="auto"/>
+        <w:jc w:val="both"/>
+        <w:rPr>
+          <w:rFonts w:ascii="Avenir Book" w:eastAsia="Times New Roman" w:hAnsi="Avenir Book" w:cs="Times New Roman"/>
+          <w:b/>
+          <w:sz w:val="21"/>
+          <w:szCs w:val="21"/>
+          <w:lang w:eastAsia="en-US"/>
+        </w:rPr>
+      </w:pPr>
+    </w:p>
+    <w:p>
+      <w:pPr>
+        <w:spacing w:after="0" w:line="240" w:lineRule="auto"/>
+        <w:jc w:val="both"/>
+        <w:rPr>
+          <w:rFonts w:ascii="Avenir Book" w:eastAsia="Times New Roman" w:hAnsi="Avenir Book" w:cs="Times New Roman"/>
+          <w:b/>
+          <w:sz w:val="21"/>
+          <w:szCs w:val="21"/>
+          <w:lang w:eastAsia="en-US"/>
+        </w:rPr>
+      </w:pPr>
+      <w:r>
+        <w:rPr>
+          <w:rFonts w:ascii="Avenir Book" w:eastAsia="Times New Roman" w:hAnsi="Avenir Book" w:cs="Times New Roman"/>
+          <w:b/>
+          <w:sz w:val="21"/>
+          <w:szCs w:val="21"/>
+          <w:lang w:eastAsia="en-US"/>
+        </w:rPr>
+        <w:t>SÉPTIMA. - IMPUESTOS.</w:t>
+      </w:r>
+    </w:p>
+    <w:p>
+      <w:pPr>
+        <w:spacing w:after="0" w:line="240" w:lineRule="auto"/>
+        <w:jc w:val="both"/>
+        <w:rPr>
+          <w:rFonts w:ascii="Avenir Book" w:eastAsia="Times New Roman" w:hAnsi="Avenir Book" w:cs="Times New Roman"/>
+          <w:sz w:val="21"/>
+          <w:szCs w:val="21"/>
+          <w:lang w:eastAsia="en-US"/>
+        </w:rPr>
+      </w:pPr>
+    </w:p>
+    <w:p>
+      <w:pPr>
+        <w:spacing w:after="0" w:line="240" w:lineRule="auto"/>
+        <w:jc w:val="both"/>
+        <w:rPr>
+          <w:rFonts w:ascii="Avenir Book" w:eastAsia="Times New Roman" w:hAnsi="Avenir Book" w:cs="Times New Roman"/>
+          <w:sz w:val="21"/>
+          <w:szCs w:val="21"/>
+          <w:lang w:eastAsia="en-US"/>
+        </w:rPr>
+      </w:pPr>
+      <w:r>
+        <w:rPr>
+          <w:rFonts w:ascii="Avenir Book" w:eastAsia="Times New Roman" w:hAnsi="Avenir Book" w:cs="Times New Roman"/>
+          <w:sz w:val="21"/>
+          <w:szCs w:val="21"/>
+          <w:lang w:eastAsia="en-US"/>
+        </w:rPr>
+        <w:t>Ambas partes acuerdan que cada una será responsable, de acuerdo con la legislación fiscal aplicable, del cumplimiento de sus respectivas obligaciones de carácter fiscal derivadas de la firma y ejecución del presente acuerdo.</w:t>
+      </w:r>
+    </w:p>
+    <w:p>
+      <w:pPr>
+        <w:spacing w:after="0" w:line="240" w:lineRule="auto"/>
+        <w:jc w:val="both"/>
+        <w:rPr>
+          <w:rFonts w:ascii="Avenir Book" w:eastAsia="Times New Roman" w:hAnsi="Avenir Book" w:cs="Times New Roman"/>
+          <w:sz w:val="21"/>
+          <w:szCs w:val="21"/>
+          <w:lang w:eastAsia="en-US"/>
+        </w:rPr>
+      </w:pPr>
+    </w:p>
+    <w:p>
+      <w:pPr>
+        <w:spacing w:after="0" w:line="240" w:lineRule="auto"/>
+        <w:jc w:val="both"/>
+        <w:rPr>
+          <w:rFonts w:ascii="Avenir Book" w:eastAsia="Times New Roman" w:hAnsi="Avenir Book" w:cs="Times New Roman"/>
+          <w:sz w:val="21"/>
+          <w:szCs w:val="21"/>
+          <w:lang w:eastAsia="en-US"/>
+        </w:rPr>
+      </w:pPr>
+      <w:r>
+        <w:rPr>
+          <w:rFonts w:ascii="Avenir Book" w:eastAsia="Times New Roman" w:hAnsi="Avenir Book" w:cs="Times New Roman"/>
+          <w:sz w:val="21"/>
+          <w:szCs w:val="21"/>
+          <w:lang w:eastAsia="en-US"/>
+        </w:rPr>
+        <w:t>"</w:t>
+      </w:r>
+      <w:r>
+        <w:rPr>
+          <w:rFonts w:ascii="Avenir Book" w:eastAsia="Times New Roman" w:hAnsi="Avenir Book" w:cs="Times New Roman"/>
+          <w:sz w:val="21"/>
+          <w:szCs w:val="21"/>
+          <w:lang w:eastAsia="en-US"/>
+        </w:rPr>
+        <w:t>EL CLIENTE</w:t>
+      </w:r>
+      <w:r>
+        <w:rPr>
+          <w:rFonts w:ascii="Avenir Book" w:eastAsia="Times New Roman" w:hAnsi="Avenir Book" w:cs="Times New Roman"/>
+          <w:sz w:val="21"/>
+          <w:szCs w:val="21"/>
+          <w:lang w:eastAsia="en-US"/>
+        </w:rPr>
+        <w:t>" se compromete a cumplir con todas las obligaciones fiscales que le correspondan, relacionadas con los servicios prestados por "</w:t>
+      </w:r>
+      <w:r>
+        <w:rPr>
+          <w:rFonts w:ascii="Avenir Book" w:eastAsia="Times New Roman" w:hAnsi="Avenir Book" w:cs="Times New Roman"/>
+          <w:sz w:val="21"/>
+          <w:szCs w:val="21"/>
+          <w:lang w:eastAsia="en-US"/>
+        </w:rPr>
+        <w:t>EL PRESTADOR DE SERVICIOS</w:t>
+      </w:r>
+      <w:r>
+        <w:rPr>
+          <w:rFonts w:ascii="Avenir Book" w:eastAsia="Times New Roman" w:hAnsi="Avenir Book" w:cs="Times New Roman"/>
+          <w:sz w:val="21"/>
+          <w:szCs w:val="21"/>
+          <w:lang w:eastAsia="en-US"/>
+        </w:rPr>
+        <w:t>" en virtud de este contrato.</w:t>
+      </w:r>
+    </w:p>
+    <w:p>
+      <w:pPr>
+        <w:spacing w:after="0" w:line="240" w:lineRule="auto"/>
+        <w:jc w:val="both"/>
+        <w:rPr>
+          <w:rFonts w:ascii="Avenir Book" w:eastAsia="Times New Roman" w:hAnsi="Avenir Book" w:cs="Times New Roman"/>
+          <w:sz w:val="21"/>
+          <w:szCs w:val="21"/>
+          <w:lang w:eastAsia="en-US"/>
+        </w:rPr>
+      </w:pPr>
+    </w:p>
+    <w:p>
+      <w:pPr>
+        <w:spacing w:after="0" w:line="240" w:lineRule="auto"/>
+        <w:jc w:val="both"/>
+        <w:rPr>
+          <w:rFonts w:ascii="Avenir Book" w:eastAsia="Times New Roman" w:hAnsi="Avenir Book" w:cs="Times New Roman"/>
+          <w:sz w:val="21"/>
+          <w:szCs w:val="21"/>
+          <w:lang w:eastAsia="en-US"/>
+        </w:rPr>
+      </w:pPr>
+      <w:r>
+        <w:rPr>
+          <w:rFonts w:ascii="Avenir Book" w:eastAsia="Times New Roman" w:hAnsi="Avenir Book" w:cs="Times New Roman"/>
+          <w:sz w:val="21"/>
+          <w:szCs w:val="21"/>
+          <w:lang w:eastAsia="en-US"/>
+        </w:rPr>
+        <w:t>Del mismo modo, "</w:t>
+      </w:r>
+      <w:r>
+        <w:rPr>
+          <w:rFonts w:ascii="Avenir Book" w:eastAsia="Times New Roman" w:hAnsi="Avenir Book" w:cs="Times New Roman"/>
+          <w:sz w:val="21"/>
+          <w:szCs w:val="21"/>
+          <w:lang w:eastAsia="en-US"/>
+        </w:rPr>
+        <w:t>EL PRESTADOR DE SERVICIOS</w:t>
+      </w:r>
+      <w:r>
+        <w:rPr>
+          <w:rFonts w:ascii="Avenir Book" w:eastAsia="Times New Roman" w:hAnsi="Avenir Book" w:cs="Times New Roman"/>
+          <w:sz w:val="21"/>
+          <w:szCs w:val="21"/>
+          <w:lang w:eastAsia="en-US"/>
+        </w:rPr>
+        <w:t>" asume la responsabilidad de cumplir con todas las obligaciones fiscales que se deriven de los servicios prestados, de acuerdo con la legislación fiscal vigente.</w:t>
+      </w:r>
+    </w:p>
+    <w:p>
+      <w:pPr>
+        <w:spacing w:after="0" w:line="240" w:lineRule="auto"/>
+        <w:jc w:val="both"/>
+        <w:rPr>
+          <w:rFonts w:ascii="Avenir Book" w:eastAsia="Times New Roman" w:hAnsi="Avenir Book" w:cs="Times New Roman"/>
+          <w:sz w:val="21"/>
+          <w:szCs w:val="21"/>
+          <w:lang w:eastAsia="en-US"/>
+        </w:rPr>
+      </w:pPr>
+    </w:p>
+    <w:p>
+      <w:pPr>
+        <w:spacing w:after="0" w:line="240" w:lineRule="auto"/>
+        <w:jc w:val="both"/>
+        <w:rPr>
+          <w:rFonts w:ascii="Avenir Book" w:eastAsia="Times New Roman" w:hAnsi="Avenir Book" w:cs="Times New Roman"/>
+          <w:sz w:val="21"/>
+          <w:szCs w:val="21"/>
+          <w:lang w:eastAsia="en-US"/>
+        </w:rPr>
+      </w:pPr>
+      <w:r>
+        <w:rPr>
+          <w:rFonts w:ascii="Avenir Book" w:eastAsia="Times New Roman" w:hAnsi="Avenir Book" w:cs="Times New Roman"/>
+          <w:sz w:val="21"/>
+          <w:szCs w:val="21"/>
+          <w:lang w:eastAsia="en-US"/>
+        </w:rPr>
+        <w:t xml:space="preserve">Ambas partes acuerdan colaborar mutuamente para proporcionar la información y documentación necesaria en caso de requerimientos fiscales, auditorías o cualquier otro procedimiento </w:t>
+      </w:r>
+      <w:r>
+        <w:rPr>
+          <w:rFonts w:ascii="Avenir Book" w:eastAsia="Times New Roman" w:hAnsi="Avenir Book" w:cs="Times New Roman"/>
+          <w:sz w:val="21"/>
+          <w:szCs w:val="21"/>
+          <w:lang w:eastAsia="en-US"/>
+        </w:rPr>
+        <w:t>fiscal.</w:t>
+      </w:r>
+    </w:p>
+    <w:p>
+      <w:pPr>
+        <w:spacing w:after="0" w:line="240" w:lineRule="auto"/>
+        <w:jc w:val="both"/>
+        <w:rPr>
+          <w:rFonts w:ascii="Avenir Book" w:eastAsia="Times New Roman" w:hAnsi="Avenir Book" w:cs="Times New Roman"/>
+          <w:sz w:val="21"/>
+          <w:szCs w:val="21"/>
+          <w:lang w:eastAsia="en-US"/>
+        </w:rPr>
+      </w:pPr>
+    </w:p>
+    <w:p>
+      <w:pPr>
+        <w:spacing w:after="0" w:line="240" w:lineRule="auto"/>
+        <w:jc w:val="both"/>
+        <w:rPr>
+          <w:rFonts w:ascii="Avenir Book" w:eastAsia="Times New Roman" w:hAnsi="Avenir Book" w:cs="Times New Roman"/>
+          <w:sz w:val="21"/>
+          <w:szCs w:val="21"/>
+          <w:lang w:eastAsia="en-US"/>
+        </w:rPr>
+      </w:pPr>
+      <w:r>
+        <w:rPr>
+          <w:rFonts w:ascii="Avenir Book" w:eastAsia="Times New Roman" w:hAnsi="Avenir Book" w:cs="Times New Roman"/>
+          <w:sz w:val="21"/>
+          <w:szCs w:val="21"/>
+          <w:lang w:eastAsia="en-US"/>
+        </w:rPr>
+        <w:t>Cualquier modificación en la legislación fiscal que afecte directamente a este contrato será comunicada por ambas partes de manera oportuna, buscando ajustar el cumplimiento a las nuevas disposiciones legales.</w:t>
+      </w:r>
+    </w:p>
+    <w:p>
+      <w:pPr>
+        <w:spacing w:after="0" w:line="240" w:lineRule="auto"/>
+        <w:jc w:val="both"/>
+        <w:rPr>
+          <w:rFonts w:ascii="Avenir Book" w:eastAsia="Times New Roman" w:hAnsi="Avenir Book" w:cs="Times New Roman"/>
+          <w:sz w:val="21"/>
+          <w:szCs w:val="21"/>
+          <w:lang w:eastAsia="en-US"/>
+        </w:rPr>
+      </w:pPr>
+    </w:p>
+    <w:p>
+      <w:pPr>
+        <w:spacing w:after="0" w:line="240" w:lineRule="auto"/>
+        <w:jc w:val="both"/>
+        <w:rPr>
+          <w:rFonts w:ascii="Avenir Book" w:eastAsia="Times New Roman" w:hAnsi="Avenir Book" w:cs="Times New Roman"/>
+          <w:sz w:val="21"/>
+          <w:szCs w:val="21"/>
+          <w:lang w:eastAsia="en-US"/>
+        </w:rPr>
+      </w:pPr>
+    </w:p>
+    <w:p>
+      <w:pPr>
+        <w:spacing w:after="0" w:line="240" w:lineRule="auto"/>
+        <w:jc w:val="both"/>
+        <w:rPr>
+          <w:rFonts w:ascii="Avenir Book" w:eastAsia="Times New Roman" w:hAnsi="Avenir Book" w:cs="Times New Roman"/>
+          <w:sz w:val="21"/>
+          <w:szCs w:val="21"/>
+          <w:lang w:eastAsia="en-US"/>
+        </w:rPr>
+      </w:pPr>
+    </w:p>
+    <w:p>
+      <w:pPr>
+        <w:spacing w:after="0" w:line="240" w:lineRule="auto"/>
+        <w:jc w:val="both"/>
+        <w:rPr>
+          <w:rFonts w:ascii="Avenir Book" w:eastAsia="Times New Roman" w:hAnsi="Avenir Book" w:cs="Times New Roman"/>
+          <w:sz w:val="21"/>
+          <w:szCs w:val="21"/>
+          <w:lang w:eastAsia="en-US"/>
+        </w:rPr>
+      </w:pPr>
+    </w:p>
+    <w:p>
+      <w:pPr>
+        <w:spacing w:after="0" w:line="240" w:lineRule="auto"/>
+        <w:jc w:val="both"/>
+        <w:rPr>
+          <w:rFonts w:ascii="Avenir Book" w:eastAsia="Times New Roman" w:hAnsi="Avenir Book" w:cs="Times New Roman"/>
+          <w:sz w:val="21"/>
+          <w:szCs w:val="21"/>
+          <w:lang w:eastAsia="en-US"/>
+        </w:rPr>
+      </w:pPr>
+    </w:p>
+    <w:p>
+      <w:pPr>
+        <w:spacing w:after="0" w:line="240" w:lineRule="auto"/>
+        <w:jc w:val="both"/>
+        <w:rPr>
+          <w:rFonts w:ascii="Avenir Book" w:eastAsia="Times New Roman" w:hAnsi="Avenir Book" w:cs="Times New Roman"/>
+          <w:sz w:val="21"/>
+          <w:szCs w:val="21"/>
+          <w:lang w:eastAsia="en-US"/>
+        </w:rPr>
+      </w:pPr>
+    </w:p>
+    <w:p>
+      <w:pPr>
+        <w:spacing w:after="0" w:line="240" w:lineRule="auto"/>
+        <w:jc w:val="both"/>
+        <w:rPr>
+          <w:rFonts w:ascii="Avenir Book" w:eastAsia="Times New Roman" w:hAnsi="Avenir Book" w:cs="Times New Roman"/>
+          <w:b/>
+          <w:sz w:val="21"/>
+          <w:szCs w:val="21"/>
+          <w:lang w:eastAsia="en-US"/>
+        </w:rPr>
+      </w:pPr>
+      <w:r>
+        <w:rPr>
+          <w:rFonts w:ascii="Avenir Book" w:eastAsia="Times New Roman" w:hAnsi="Avenir Book" w:cs="Times New Roman"/>
+          <w:b/>
+          <w:sz w:val="21"/>
+          <w:szCs w:val="21"/>
+          <w:lang w:eastAsia="en-US"/>
+        </w:rPr>
+        <w:t xml:space="preserve">OCTAVA. - VIGENCIA. </w:t>
+      </w:r>
+    </w:p>
+    <w:p>
+      <w:pPr>
+        <w:spacing w:after="0" w:line="240" w:lineRule="auto"/>
+        <w:jc w:val="both"/>
+        <w:rPr>
+          <w:rFonts w:ascii="Avenir Book" w:eastAsia="Times New Roman" w:hAnsi="Avenir Book" w:cs="Times New Roman"/>
+          <w:sz w:val="21"/>
+          <w:szCs w:val="21"/>
+          <w:lang w:eastAsia="en-US"/>
+        </w:rPr>
+      </w:pPr>
+    </w:p>
+    <w:p>
+      <w:pPr>
+        <w:spacing w:after="0" w:line="240" w:lineRule="auto"/>
+        <w:jc w:val="both"/>
+        <w:rPr>
+          <w:rFonts w:ascii="Avenir Book" w:eastAsia="Times New Roman" w:hAnsi="Avenir Book" w:cs="Times New Roman"/>
+          <w:sz w:val="21"/>
+          <w:szCs w:val="21"/>
+          <w:lang w:eastAsia="en-US"/>
+        </w:rPr>
+      </w:pPr>
+      <w:r>
+        <w:rPr>
+          <w:rFonts w:ascii="Avenir Book" w:eastAsia="Times New Roman" w:hAnsi="Avenir Book" w:cs="Times New Roman"/>
+          <w:sz w:val="21"/>
+          <w:szCs w:val="21"/>
+          <w:lang w:eastAsia="en-US"/>
+        </w:rPr>
+        <w:t xml:space="preserve">“LAS PARTES” convienen que la duración del presente contrato será de 1 (uno) año el cual iniciará surtiendo sus efectos a partir del día </w:t>
+      </w:r>
+      <w:r>
+        <w:rPr>
+          <w:rFonts w:ascii="Avenir Book" w:eastAsia="Times New Roman" w:hAnsi="Avenir Book" w:cs="Times New Roman"/>
           <w:color w:val="FF0000"/>
           <w:sz w:val="21"/>
           <w:szCs w:val="21"/>
           <w:lang w:eastAsia="en-US"/>
         </w:rPr>
-        <w:t>{{EL_CLIENTE}}</w:t>
-      </w:r>
-      <w:r>
-        <w:rPr>
-          <w:rFonts w:ascii="Avenir Book" w:eastAsia="Times New Roman" w:hAnsi="Avenir Book" w:cs="Times New Roman"/>
-          <w:sz w:val="21"/>
-          <w:szCs w:val="21"/>
-          <w:lang w:eastAsia="en-US"/>
-        </w:rPr>
-        <w:t>” pueda utilizar los servicios de administración de recursos tendientes al pago de compensaciones y/o indemnizaciones, el “</w:t>
+        <w:t>{{V</w:t>
+      </w:r>
+      <w:r>
+        <w:rPr>
+          <w:rFonts w:ascii="Avenir Book" w:eastAsia="Times New Roman" w:hAnsi="Avenir Book" w:cs="Times New Roman"/>
+          <w:color w:val="FF0000"/>
+          <w:sz w:val="21"/>
+          <w:szCs w:val="21"/>
+          <w:lang w:eastAsia="en-US"/>
+        </w:rPr>
+        <w:t>ID}}</w:t>
+      </w:r>
+      <w:r>
+        <w:rPr>
+          <w:rFonts w:ascii="Avenir Book" w:eastAsia="Times New Roman" w:hAnsi="Avenir Book" w:cs="Times New Roman"/>
+          <w:sz w:val="21"/>
+          <w:szCs w:val="21"/>
+          <w:lang w:eastAsia="en-US"/>
+        </w:rPr>
+        <w:t xml:space="preserve"> de </w:t>
+      </w:r>
+      <w:r>
+        <w:rPr>
+          <w:rFonts w:ascii="Avenir Book" w:eastAsia="Times New Roman" w:hAnsi="Avenir Book" w:cs="Times New Roman"/>
+          <w:color w:val="FF0000"/>
+          <w:sz w:val="21"/>
+          <w:szCs w:val="21"/>
+          <w:lang w:eastAsia="en-US"/>
+        </w:rPr>
+        <w:t>{{VI</w:t>
+      </w:r>
+      <w:r>
+        <w:rPr>
+          <w:rFonts w:ascii="Avenir Book" w:eastAsia="Times New Roman" w:hAnsi="Avenir Book" w:cs="Times New Roman"/>
+          <w:color w:val="FF0000"/>
+          <w:sz w:val="21"/>
+          <w:szCs w:val="21"/>
+          <w:lang w:eastAsia="en-US"/>
+        </w:rPr>
+        <w:t>M</w:t>
+      </w:r>
+      <w:r>
+        <w:rPr>
+          <w:rFonts w:ascii="Avenir Book" w:eastAsia="Times New Roman" w:hAnsi="Avenir Book" w:cs="Times New Roman"/>
+          <w:color w:val="FF0000"/>
+          <w:sz w:val="21"/>
+          <w:szCs w:val="21"/>
+          <w:lang w:eastAsia="en-US"/>
+        </w:rPr>
+        <w:t>}}</w:t>
+      </w:r>
+      <w:r>
+        <w:rPr>
+          <w:rFonts w:ascii="Avenir Book" w:eastAsia="Times New Roman" w:hAnsi="Avenir Book" w:cs="Times New Roman"/>
+          <w:sz w:val="21"/>
+          <w:szCs w:val="21"/>
+          <w:lang w:eastAsia="en-US"/>
+        </w:rPr>
+        <w:t xml:space="preserve"> del año </w:t>
+      </w:r>
+      <w:r>
+        <w:rPr>
+          <w:rFonts w:ascii="Avenir Book" w:eastAsia="Times New Roman" w:hAnsi="Avenir Book" w:cs="Times New Roman"/>
+          <w:color w:val="FF0000"/>
+          <w:sz w:val="21"/>
+          <w:szCs w:val="21"/>
+          <w:lang w:eastAsia="en-US"/>
+        </w:rPr>
+        <w:t>{{VI</w:t>
+      </w:r>
+      <w:r>
+        <w:rPr>
+          <w:rFonts w:ascii="Avenir Book" w:eastAsia="Times New Roman" w:hAnsi="Avenir Book" w:cs="Times New Roman"/>
+          <w:color w:val="FF0000"/>
+          <w:sz w:val="21"/>
+          <w:szCs w:val="21"/>
+          <w:lang w:eastAsia="en-US"/>
+        </w:rPr>
+        <w:t>A</w:t>
+      </w:r>
+      <w:r>
+        <w:rPr>
+          <w:rFonts w:ascii="Avenir Book" w:eastAsia="Times New Roman" w:hAnsi="Avenir Book" w:cs="Times New Roman"/>
+          <w:color w:val="FF0000"/>
+          <w:sz w:val="21"/>
+          <w:szCs w:val="21"/>
+          <w:lang w:eastAsia="en-US"/>
+        </w:rPr>
+        <w:t>}}</w:t>
+      </w:r>
+      <w:r>
+        <w:rPr>
+          <w:rFonts w:ascii="Avenir Book" w:eastAsia="Times New Roman" w:hAnsi="Avenir Book" w:cs="Times New Roman"/>
+          <w:sz w:val="21"/>
+          <w:szCs w:val="21"/>
+          <w:lang w:eastAsia="en-US"/>
+        </w:rPr>
+        <w:t xml:space="preserve"> y terminando precisamente el día </w:t>
+      </w:r>
+      <w:r>
+        <w:rPr>
+          <w:rFonts w:ascii="Avenir Book" w:eastAsia="Times New Roman" w:hAnsi="Avenir Book" w:cs="Times New Roman"/>
+          <w:color w:val="FF0000"/>
+          <w:sz w:val="21"/>
+          <w:szCs w:val="21"/>
+          <w:lang w:eastAsia="en-US"/>
+        </w:rPr>
+        <w:t>{{V</w:t>
+      </w:r>
+      <w:r>
+        <w:rPr>
+          <w:rFonts w:ascii="Avenir Book" w:eastAsia="Times New Roman" w:hAnsi="Avenir Book" w:cs="Times New Roman"/>
+          <w:color w:val="FF0000"/>
+          <w:sz w:val="21"/>
+          <w:szCs w:val="21"/>
+          <w:lang w:eastAsia="en-US"/>
+        </w:rPr>
+        <w:t>T</w:t>
+      </w:r>
+      <w:r>
+        <w:rPr>
+          <w:rFonts w:ascii="Avenir Book" w:eastAsia="Times New Roman" w:hAnsi="Avenir Book" w:cs="Times New Roman"/>
+          <w:color w:val="FF0000"/>
+          <w:sz w:val="21"/>
+          <w:szCs w:val="21"/>
+          <w:lang w:eastAsia="en-US"/>
+        </w:rPr>
+        <w:t>D}}</w:t>
+      </w:r>
+      <w:r>
+        <w:rPr>
+          <w:rFonts w:ascii="Avenir Book" w:eastAsia="Times New Roman" w:hAnsi="Avenir Book" w:cs="Times New Roman"/>
+          <w:sz w:val="21"/>
+          <w:szCs w:val="21"/>
+          <w:lang w:eastAsia="en-US"/>
+        </w:rPr>
+        <w:t xml:space="preserve"> de </w:t>
+      </w:r>
+      <w:r>
+        <w:rPr>
+          <w:rFonts w:ascii="Avenir Book" w:eastAsia="Times New Roman" w:hAnsi="Avenir Book" w:cs="Times New Roman"/>
+          <w:color w:val="FF0000"/>
+          <w:sz w:val="21"/>
+          <w:szCs w:val="21"/>
+          <w:lang w:eastAsia="en-US"/>
+        </w:rPr>
+        <w:t>{{V</w:t>
+      </w:r>
+      <w:r>
+        <w:rPr>
+          <w:rFonts w:ascii="Avenir Book" w:eastAsia="Times New Roman" w:hAnsi="Avenir Book" w:cs="Times New Roman"/>
+          <w:color w:val="FF0000"/>
+          <w:sz w:val="21"/>
+          <w:szCs w:val="21"/>
+          <w:lang w:eastAsia="en-US"/>
+        </w:rPr>
+        <w:t>TM</w:t>
+      </w:r>
+      <w:r>
+        <w:rPr>
+          <w:rFonts w:ascii="Avenir Book" w:eastAsia="Times New Roman" w:hAnsi="Avenir Book" w:cs="Times New Roman"/>
+          <w:color w:val="FF0000"/>
+          <w:sz w:val="21"/>
+          <w:szCs w:val="21"/>
+          <w:lang w:eastAsia="en-US"/>
+        </w:rPr>
+        <w:t>}}</w:t>
+      </w:r>
+      <w:r>
+        <w:rPr>
+          <w:rFonts w:ascii="Avenir Book" w:eastAsia="Times New Roman" w:hAnsi="Avenir Book" w:cs="Times New Roman"/>
+          <w:sz w:val="21"/>
+          <w:szCs w:val="21"/>
+          <w:lang w:eastAsia="en-US"/>
+        </w:rPr>
+        <w:t xml:space="preserve"> del año </w:t>
+      </w:r>
+      <w:r>
+        <w:rPr>
+          <w:rFonts w:ascii="Avenir Book" w:eastAsia="Times New Roman" w:hAnsi="Avenir Book" w:cs="Times New Roman"/>
+          <w:color w:val="FF0000"/>
+          <w:sz w:val="21"/>
+          <w:szCs w:val="21"/>
+          <w:lang w:eastAsia="en-US"/>
+        </w:rPr>
+        <w:t>{{V</w:t>
+      </w:r>
+      <w:r>
+        <w:rPr>
+          <w:rFonts w:ascii="Avenir Book" w:eastAsia="Times New Roman" w:hAnsi="Avenir Book" w:cs="Times New Roman"/>
+          <w:color w:val="FF0000"/>
+          <w:sz w:val="21"/>
+          <w:szCs w:val="21"/>
+          <w:lang w:eastAsia="en-US"/>
+        </w:rPr>
+        <w:t>TA</w:t>
+      </w:r>
+      <w:r>
+        <w:rPr>
+          <w:rFonts w:ascii="Avenir Book" w:eastAsia="Times New Roman" w:hAnsi="Avenir Book" w:cs="Times New Roman"/>
+          <w:color w:val="FF0000"/>
+          <w:sz w:val="21"/>
+          <w:szCs w:val="21"/>
+          <w:lang w:eastAsia="en-US"/>
+        </w:rPr>
+        <w:t>}}</w:t>
+      </w:r>
+      <w:r>
+        <w:rPr>
+          <w:rFonts w:ascii="Avenir Book" w:eastAsia="Times New Roman" w:hAnsi="Avenir Book" w:cs="Times New Roman"/>
+          <w:sz w:val="21"/>
+          <w:szCs w:val="21"/>
+          <w:lang w:eastAsia="en-US"/>
+        </w:rPr>
+        <w:t>.</w:t>
+      </w:r>
+    </w:p>
+    <w:p>
+      <w:pPr>
+        <w:spacing w:after="0" w:line="240" w:lineRule="auto"/>
+        <w:jc w:val="both"/>
+        <w:rPr>
+          <w:rFonts w:ascii="Avenir Book" w:eastAsia="Times New Roman" w:hAnsi="Avenir Book" w:cs="Times New Roman"/>
+          <w:sz w:val="21"/>
+          <w:szCs w:val="21"/>
+          <w:lang w:eastAsia="en-US"/>
+        </w:rPr>
+      </w:pPr>
+    </w:p>
+    <w:p>
+      <w:pPr>
+        <w:spacing w:after="0" w:line="240" w:lineRule="auto"/>
+        <w:jc w:val="both"/>
+        <w:rPr>
+          <w:rFonts w:ascii="Avenir Book" w:eastAsia="Times New Roman" w:hAnsi="Avenir Book" w:cs="Times New Roman"/>
+          <w:sz w:val="21"/>
+          <w:szCs w:val="21"/>
+          <w:lang w:eastAsia="en-US"/>
+        </w:rPr>
+      </w:pPr>
+      <w:r>
+        <w:rPr>
+          <w:rFonts w:ascii="Avenir Book" w:eastAsia="Times New Roman" w:hAnsi="Avenir Book" w:cs="Times New Roman"/>
+          <w:sz w:val="21"/>
+          <w:szCs w:val="21"/>
+          <w:lang w:eastAsia="en-US"/>
+        </w:rPr>
+        <w:t>El presente contrato terminará al momento de que finalice su vigencia, o bien, que alguna de las partes opte por la terminación anticipada del mismo, la cual se detalla en la cláusula inmediata siguiente.</w:t>
+      </w:r>
+    </w:p>
+    <w:p>
+      <w:pPr>
+        <w:spacing w:after="0" w:line="240" w:lineRule="auto"/>
+        <w:jc w:val="both"/>
+        <w:rPr>
+          <w:rFonts w:ascii="Avenir Book" w:eastAsia="Times New Roman" w:hAnsi="Avenir Book" w:cs="Times New Roman"/>
+          <w:sz w:val="21"/>
+          <w:szCs w:val="21"/>
+          <w:lang w:eastAsia="en-US"/>
+        </w:rPr>
+      </w:pPr>
+    </w:p>
+    <w:p>
+      <w:pPr>
+        <w:spacing w:after="0" w:line="240" w:lineRule="auto"/>
+        <w:jc w:val="both"/>
+        <w:rPr>
+          <w:rFonts w:ascii="Avenir Book" w:eastAsia="Times New Roman" w:hAnsi="Avenir Book" w:cs="Times New Roman"/>
+          <w:b/>
+          <w:color w:val="000000"/>
+          <w:sz w:val="21"/>
+          <w:szCs w:val="21"/>
+          <w:lang w:eastAsia="en-US"/>
+        </w:rPr>
+      </w:pPr>
+      <w:r>
+        <w:rPr>
+          <w:rFonts w:ascii="Avenir Book" w:eastAsia="Times New Roman" w:hAnsi="Avenir Book" w:cs="Times New Roman"/>
+          <w:b/>
+          <w:sz w:val="21"/>
+          <w:szCs w:val="21"/>
+          <w:lang w:eastAsia="en-US"/>
+        </w:rPr>
+        <w:t xml:space="preserve">NOVENA. - </w:t>
+      </w:r>
+      <w:r>
+        <w:rPr>
+          <w:rFonts w:ascii="Avenir Book" w:eastAsia="Times New Roman" w:hAnsi="Avenir Book" w:cs="Times New Roman"/>
+          <w:b/>
+          <w:color w:val="000000"/>
+          <w:sz w:val="21"/>
+          <w:szCs w:val="21"/>
+          <w:lang w:eastAsia="en-US"/>
+        </w:rPr>
+        <w:t xml:space="preserve">TERMINACIÓN ANTICIPADA. </w:t>
+      </w:r>
+    </w:p>
+    <w:p>
+      <w:pPr>
+        <w:spacing w:after="0" w:line="240" w:lineRule="auto"/>
+        <w:jc w:val="both"/>
+        <w:rPr>
+          <w:rFonts w:ascii="Avenir Book" w:eastAsia="Times New Roman" w:hAnsi="Avenir Book" w:cs="Times New Roman"/>
+          <w:b/>
+          <w:color w:val="000000"/>
+          <w:sz w:val="21"/>
+          <w:szCs w:val="21"/>
+          <w:lang w:eastAsia="en-US"/>
+        </w:rPr>
+      </w:pPr>
+    </w:p>
+    <w:p>
+      <w:pPr>
+        <w:spacing w:after="0" w:line="240" w:lineRule="auto"/>
+        <w:jc w:val="both"/>
+        <w:rPr>
+          <w:rFonts w:ascii="Avenir Book" w:eastAsia="Times New Roman" w:hAnsi="Avenir Book" w:cs="Times New Roman"/>
+          <w:sz w:val="21"/>
+          <w:szCs w:val="21"/>
+          <w:lang w:eastAsia="en-US"/>
+        </w:rPr>
+      </w:pPr>
+      <w:r>
+        <w:rPr>
+          <w:rFonts w:ascii="Avenir Book" w:eastAsia="Times New Roman" w:hAnsi="Avenir Book" w:cs="Times New Roman"/>
+          <w:sz w:val="21"/>
+          <w:szCs w:val="21"/>
+          <w:lang w:eastAsia="en-US"/>
+        </w:rPr>
+        <w:t xml:space="preserve">Para en caso de que alguna de “LAS PARTES” quisiera dar por terminado el presente contrato antes de la fecha de su terminación, deberá de notificarlo a la otra con por lo menos 60 sesenta días de anticipación a la fecha en la que pretenda dar por concluida la relación contractual. </w:t>
+      </w:r>
+    </w:p>
+    <w:p>
+      <w:pPr>
+        <w:spacing w:after="0" w:line="240" w:lineRule="auto"/>
+        <w:jc w:val="both"/>
+        <w:rPr>
+          <w:rFonts w:ascii="Avenir Book" w:eastAsia="Times New Roman" w:hAnsi="Avenir Book" w:cs="Times New Roman"/>
+          <w:sz w:val="21"/>
+          <w:szCs w:val="21"/>
+          <w:lang w:eastAsia="en-US"/>
+        </w:rPr>
+      </w:pPr>
+    </w:p>
+    <w:p>
+      <w:pPr>
+        <w:spacing w:after="0" w:line="240" w:lineRule="auto"/>
+        <w:jc w:val="both"/>
+        <w:rPr>
+          <w:rFonts w:ascii="Avenir Book" w:eastAsia="Times New Roman" w:hAnsi="Avenir Book" w:cs="Times New Roman"/>
+          <w:sz w:val="21"/>
+          <w:szCs w:val="21"/>
+          <w:lang w:eastAsia="en-US"/>
+        </w:rPr>
+      </w:pPr>
+      <w:r>
+        <w:rPr>
+          <w:rFonts w:ascii="Avenir Book" w:eastAsia="Times New Roman" w:hAnsi="Avenir Book" w:cs="Times New Roman"/>
+          <w:sz w:val="21"/>
+          <w:szCs w:val="21"/>
+          <w:lang w:eastAsia="en-US"/>
+        </w:rPr>
+        <w:t xml:space="preserve">Adicional a lo anterior, la parte que solicite la terminación anticipada el presente instrumento, deberá de pagar a la parte afectada una pena convencional consistente en la cantidad que resulte de sacar el promedio de la comisión </w:t>
+      </w:r>
+      <w:r>
+        <w:rPr>
+          <w:rFonts w:ascii="Avenir Book" w:eastAsia="Times New Roman" w:hAnsi="Avenir Book" w:cs="Times New Roman"/>
+          <w:sz w:val="21"/>
+          <w:szCs w:val="21"/>
+          <w:lang w:eastAsia="en-US"/>
+        </w:rPr>
+        <w:t>pagada los últimos 6 seis meses, multiplicada por tres, más el correspondiente Impuesto al Valor Agregado; haciéndose la especificación relativa a que dichas cantidades serán independientes a las que en su caso se adeuden por “</w:t>
+      </w:r>
+      <w:r>
+        <w:rPr>
+          <w:rFonts w:ascii="Avenir Book" w:eastAsia="Times New Roman" w:hAnsi="Avenir Book" w:cs="Times New Roman"/>
+          <w:sz w:val="21"/>
+          <w:szCs w:val="21"/>
+          <w:lang w:eastAsia="en-US"/>
+        </w:rPr>
+        <w:t>EL CLIENTE</w:t>
+      </w:r>
+      <w:r>
+        <w:rPr>
+          <w:rFonts w:ascii="Avenir Book" w:eastAsia="Times New Roman" w:hAnsi="Avenir Book" w:cs="Times New Roman"/>
+          <w:sz w:val="21"/>
+          <w:szCs w:val="21"/>
+          <w:lang w:eastAsia="en-US"/>
+        </w:rPr>
+        <w:t>” con motivo de la prestación de los servicios a los que se aluden en la cláusula identificada como PRIMERA del presente acuerdo de voluntades.</w:t>
+      </w:r>
+    </w:p>
+    <w:p>
+      <w:pPr>
+        <w:spacing w:after="0" w:line="240" w:lineRule="auto"/>
+        <w:jc w:val="both"/>
+        <w:rPr>
+          <w:rFonts w:ascii="Avenir Book" w:eastAsia="Times New Roman" w:hAnsi="Avenir Book" w:cs="Times New Roman"/>
+          <w:sz w:val="21"/>
+          <w:szCs w:val="21"/>
+          <w:lang w:eastAsia="en-US"/>
+        </w:rPr>
+      </w:pPr>
+    </w:p>
+    <w:p>
+      <w:pPr>
+        <w:spacing w:after="0" w:line="240" w:lineRule="auto"/>
+        <w:jc w:val="both"/>
+        <w:rPr>
+          <w:rFonts w:ascii="Avenir Book" w:eastAsia="Times New Roman" w:hAnsi="Avenir Book" w:cs="Times New Roman"/>
+          <w:sz w:val="21"/>
+          <w:szCs w:val="21"/>
+          <w:lang w:eastAsia="en-US"/>
+        </w:rPr>
+      </w:pPr>
+      <w:r>
+        <w:rPr>
+          <w:rFonts w:ascii="Avenir Book" w:eastAsia="Times New Roman" w:hAnsi="Avenir Book" w:cs="Times New Roman"/>
+          <w:sz w:val="21"/>
+          <w:szCs w:val="21"/>
+          <w:lang w:eastAsia="en-US"/>
+        </w:rPr>
+        <w:t>Ahora bien, para en caso de que exista un saldo a favor del “CLIENTE” del fondo de compensaciones de salud en el trabajo y opere la terminación anticipada del presente contrato, “</w:t>
       </w:r>
       <w:r>
         <w:rPr>
@@ -4383,966 +5486,16 @@
           <w:szCs w:val="21"/>
           <w:lang w:eastAsia="en-US"/>
         </w:rPr>
-        <w:t xml:space="preserve">” deberá tener celebrado un contrato colectivo de trabajo con el sindicato de su elección, en el cual haya convenido indemnizar a los trabajadores en caso de incumplimiento a las NOMS señaladas con anterioridad en el presente Contrato, medina una cuantificación extrajudicial derivada de un cálculo actuarial realizado por perito. </w:t>
-      </w:r>
-    </w:p>
-    <w:p>
-      <w:pPr>
-        <w:spacing w:after="0" w:line="240" w:lineRule="auto"/>
-        <w:jc w:val="both"/>
-        <w:rPr>
-          <w:rFonts w:ascii="Avenir Book" w:eastAsia="Times New Roman" w:hAnsi="Avenir Book" w:cs="Times New Roman"/>
-          <w:sz w:val="21"/>
-          <w:szCs w:val="21"/>
-          <w:lang w:eastAsia="en-US"/>
-        </w:rPr>
-      </w:pPr>
-    </w:p>
-    <w:p>
-      <w:pPr>
-        <w:spacing w:after="0" w:line="240" w:lineRule="auto"/>
-        <w:jc w:val="both"/>
-        <w:rPr>
-          <w:rFonts w:ascii="Avenir Book" w:eastAsia="Times New Roman" w:hAnsi="Avenir Book" w:cs="Times New Roman"/>
-          <w:sz w:val="21"/>
-          <w:szCs w:val="21"/>
-          <w:lang w:eastAsia="en-US"/>
-        </w:rPr>
-      </w:pPr>
-      <w:r>
-        <w:rPr>
-          <w:rFonts w:ascii="Avenir Book" w:eastAsia="Times New Roman" w:hAnsi="Avenir Book" w:cs="Times New Roman"/>
-          <w:sz w:val="21"/>
-          <w:szCs w:val="21"/>
-          <w:lang w:eastAsia="en-US"/>
-        </w:rPr>
-        <w:t xml:space="preserve">Asimismo, en dicho contrato deberá estar prevista la obligación de compensar y/o indemnizar a los trabajadores en caso de que exista y persista algún elemento que, conforme a los Normas Oficiales Mexicanas en materia de Salud en el Trabajo, generen o puedan generar un detrimento en la salud de los empleados de manera continuada, designando para la evaluación y administración de los recursos destinados a ellos a </w:t>
-      </w:r>
-      <w:proofErr w:type="spellStart"/>
-      <w:r>
-        <w:rPr>
-          <w:rFonts w:ascii="Avenir Book" w:eastAsia="Times New Roman" w:hAnsi="Avenir Book" w:cs="Times New Roman"/>
-          <w:sz w:val="21"/>
-          <w:szCs w:val="21"/>
-          <w:lang w:eastAsia="en-US"/>
-        </w:rPr>
-        <w:t>el</w:t>
-      </w:r>
-      <w:proofErr w:type="spellEnd"/>
-      <w:r>
-        <w:rPr>
-          <w:rFonts w:ascii="Avenir Book" w:eastAsia="Times New Roman" w:hAnsi="Avenir Book" w:cs="Times New Roman"/>
-          <w:sz w:val="21"/>
-          <w:szCs w:val="21"/>
-          <w:lang w:eastAsia="en-US"/>
-        </w:rPr>
-        <w:t xml:space="preserve"> “</w:t>
-      </w:r>
-      <w:r>
-        <w:rPr>
-          <w:rFonts w:ascii="Avenir Book" w:eastAsia="Times New Roman" w:hAnsi="Avenir Book" w:cs="Times New Roman"/>
-          <w:sz w:val="21"/>
-          <w:szCs w:val="21"/>
-          <w:lang w:eastAsia="en-US"/>
-        </w:rPr>
-        <w:t>EL PRESTADOR DE SERVICIOS</w:t>
-      </w:r>
-      <w:r>
-        <w:rPr>
-          <w:rFonts w:ascii="Avenir Book" w:eastAsia="Times New Roman" w:hAnsi="Avenir Book" w:cs="Times New Roman"/>
-          <w:sz w:val="21"/>
-          <w:szCs w:val="21"/>
-          <w:lang w:eastAsia="en-US"/>
-        </w:rPr>
-        <w:t>” y/o a quien este último designe para tales efectos.</w:t>
-      </w:r>
-    </w:p>
-    <w:p>
-      <w:pPr>
-        <w:spacing w:after="0" w:line="240" w:lineRule="auto"/>
-        <w:jc w:val="both"/>
-        <w:rPr>
-          <w:rFonts w:ascii="Avenir Book" w:eastAsia="Times New Roman" w:hAnsi="Avenir Book" w:cs="Times New Roman"/>
-          <w:sz w:val="21"/>
-          <w:szCs w:val="21"/>
-          <w:lang w:eastAsia="en-US"/>
-        </w:rPr>
-      </w:pPr>
-    </w:p>
-    <w:p>
-      <w:pPr>
-        <w:spacing w:after="0" w:line="240" w:lineRule="auto"/>
-        <w:jc w:val="both"/>
-        <w:rPr>
-          <w:rFonts w:ascii="Avenir Book" w:eastAsia="Times New Roman" w:hAnsi="Avenir Book" w:cs="Times New Roman"/>
-          <w:sz w:val="21"/>
-          <w:szCs w:val="21"/>
-          <w:lang w:eastAsia="en-US"/>
-        </w:rPr>
-      </w:pPr>
-      <w:r>
-        <w:rPr>
-          <w:rFonts w:ascii="Avenir Book" w:eastAsia="Times New Roman" w:hAnsi="Avenir Book" w:cs="Times New Roman"/>
-          <w:sz w:val="21"/>
-          <w:szCs w:val="21"/>
-          <w:lang w:eastAsia="en-US"/>
-        </w:rPr>
-        <w:t>Al efecto, las partes están de acuerdo en acordar de manera conjunta con el sindicato la redacción de dicha cláusula, de manera que exista un equilibrio adecuado entre el patrón, sindicato y trabajadores, en lo que se logra la completa regularización de “</w:t>
-      </w:r>
-      <w:r>
-        <w:rPr>
-          <w:rFonts w:ascii="Avenir Book" w:eastAsia="Times New Roman" w:hAnsi="Avenir Book" w:cs="Times New Roman"/>
-          <w:color w:val="FF0000"/>
-          <w:sz w:val="21"/>
-          <w:szCs w:val="21"/>
-          <w:lang w:eastAsia="en-US"/>
-        </w:rPr>
-        <w:t>{{EL_CLIENTE}}</w:t>
-      </w:r>
-      <w:r>
-        <w:rPr>
-          <w:rFonts w:ascii="Avenir Book" w:eastAsia="Times New Roman" w:hAnsi="Avenir Book" w:cs="Times New Roman"/>
-          <w:sz w:val="21"/>
-          <w:szCs w:val="21"/>
-          <w:lang w:eastAsia="en-US"/>
-        </w:rPr>
-        <w:t>” a los requerimientos de las Normas Oficiales Mexicanas multicitadas.</w:t>
-      </w:r>
-    </w:p>
-    <w:p>
-      <w:pPr>
-        <w:spacing w:after="0" w:line="240" w:lineRule="auto"/>
-        <w:jc w:val="both"/>
-        <w:rPr>
-          <w:rFonts w:ascii="Avenir Book" w:eastAsia="Times New Roman" w:hAnsi="Avenir Book" w:cs="Times New Roman"/>
-          <w:b/>
-          <w:sz w:val="21"/>
-          <w:szCs w:val="21"/>
-          <w:lang w:eastAsia="en-US"/>
-        </w:rPr>
-      </w:pPr>
-    </w:p>
-    <w:p>
-      <w:pPr>
-        <w:spacing w:after="0" w:line="240" w:lineRule="auto"/>
-        <w:jc w:val="both"/>
-        <w:rPr>
-          <w:rFonts w:ascii="Avenir Book" w:eastAsia="Times New Roman" w:hAnsi="Avenir Book" w:cs="Times New Roman"/>
-          <w:b/>
-          <w:sz w:val="21"/>
-          <w:szCs w:val="21"/>
-          <w:lang w:eastAsia="en-US"/>
-        </w:rPr>
-      </w:pPr>
-      <w:r>
-        <w:rPr>
-          <w:rFonts w:ascii="Avenir Book" w:eastAsia="Times New Roman" w:hAnsi="Avenir Book" w:cs="Times New Roman"/>
-          <w:b/>
-          <w:sz w:val="21"/>
-          <w:szCs w:val="21"/>
-          <w:lang w:eastAsia="en-US"/>
-        </w:rPr>
-        <w:t>SÉPTIMA. - IMPUESTOS.</w:t>
-      </w:r>
-    </w:p>
-    <w:p>
-      <w:pPr>
-        <w:spacing w:after="0" w:line="240" w:lineRule="auto"/>
-        <w:jc w:val="both"/>
-        <w:rPr>
-          <w:rFonts w:ascii="Avenir Book" w:eastAsia="Times New Roman" w:hAnsi="Avenir Book" w:cs="Times New Roman"/>
-          <w:sz w:val="21"/>
-          <w:szCs w:val="21"/>
-          <w:lang w:eastAsia="en-US"/>
-        </w:rPr>
-      </w:pPr>
-    </w:p>
-    <w:p>
-      <w:pPr>
-        <w:spacing w:after="0" w:line="240" w:lineRule="auto"/>
-        <w:jc w:val="both"/>
-        <w:rPr>
-          <w:rFonts w:ascii="Avenir Book" w:eastAsia="Times New Roman" w:hAnsi="Avenir Book" w:cs="Times New Roman"/>
-          <w:sz w:val="21"/>
-          <w:szCs w:val="21"/>
-          <w:lang w:eastAsia="en-US"/>
-        </w:rPr>
-      </w:pPr>
-      <w:r>
-        <w:rPr>
-          <w:rFonts w:ascii="Avenir Book" w:eastAsia="Times New Roman" w:hAnsi="Avenir Book" w:cs="Times New Roman"/>
-          <w:sz w:val="21"/>
-          <w:szCs w:val="21"/>
-          <w:lang w:eastAsia="en-US"/>
-        </w:rPr>
-        <w:t>Ambas partes acuerdan que cada una será responsable, de acuerdo con la legislación fiscal aplicable, del cumplimiento de sus respectivas obligaciones de carácter fiscal derivadas de la firma y ejecución del presente acuerdo.</w:t>
-      </w:r>
-    </w:p>
-    <w:p>
-      <w:pPr>
-        <w:spacing w:after="0" w:line="240" w:lineRule="auto"/>
-        <w:jc w:val="both"/>
-        <w:rPr>
-          <w:rFonts w:ascii="Avenir Book" w:eastAsia="Times New Roman" w:hAnsi="Avenir Book" w:cs="Times New Roman"/>
-          <w:sz w:val="21"/>
-          <w:szCs w:val="21"/>
-          <w:lang w:eastAsia="en-US"/>
-        </w:rPr>
-      </w:pPr>
-    </w:p>
-    <w:p>
-      <w:pPr>
-        <w:spacing w:after="0" w:line="240" w:lineRule="auto"/>
-        <w:jc w:val="both"/>
-        <w:rPr>
-          <w:rFonts w:ascii="Avenir Book" w:eastAsia="Times New Roman" w:hAnsi="Avenir Book" w:cs="Times New Roman"/>
-          <w:sz w:val="21"/>
-          <w:szCs w:val="21"/>
-          <w:lang w:eastAsia="en-US"/>
-        </w:rPr>
-      </w:pPr>
-      <w:r>
-        <w:rPr>
-          <w:rFonts w:ascii="Avenir Book" w:eastAsia="Times New Roman" w:hAnsi="Avenir Book" w:cs="Times New Roman"/>
-          <w:sz w:val="21"/>
-          <w:szCs w:val="21"/>
-          <w:lang w:eastAsia="en-US"/>
-        </w:rPr>
-        <w:t>"</w:t>
-      </w:r>
-      <w:r>
-        <w:rPr>
-          <w:rFonts w:ascii="Avenir Book" w:eastAsia="Times New Roman" w:hAnsi="Avenir Book" w:cs="Times New Roman"/>
-          <w:color w:val="FF0000"/>
-          <w:sz w:val="21"/>
-          <w:szCs w:val="21"/>
-          <w:lang w:eastAsia="en-US"/>
-        </w:rPr>
-        <w:t>{{EL_CLIENTE}}</w:t>
-      </w:r>
-      <w:r>
-        <w:rPr>
-          <w:rFonts w:ascii="Avenir Book" w:eastAsia="Times New Roman" w:hAnsi="Avenir Book" w:cs="Times New Roman"/>
-          <w:sz w:val="21"/>
-          <w:szCs w:val="21"/>
-          <w:lang w:eastAsia="en-US"/>
-        </w:rPr>
-        <w:t>" se compromete a cumplir con todas las obligaciones fiscales que le correspondan, relacionadas con los servicios prestados por "</w:t>
-      </w:r>
-      <w:r>
-        <w:rPr>
-          <w:rFonts w:ascii="Avenir Book" w:eastAsia="Times New Roman" w:hAnsi="Avenir Book" w:cs="Times New Roman"/>
-          <w:sz w:val="21"/>
-          <w:szCs w:val="21"/>
-          <w:lang w:eastAsia="en-US"/>
-        </w:rPr>
-        <w:t>EL PRESTADOR DE SERVICIOS</w:t>
-      </w:r>
-      <w:r>
-        <w:rPr>
-          <w:rFonts w:ascii="Avenir Book" w:eastAsia="Times New Roman" w:hAnsi="Avenir Book" w:cs="Times New Roman"/>
-          <w:sz w:val="21"/>
-          <w:szCs w:val="21"/>
-          <w:lang w:eastAsia="en-US"/>
-        </w:rPr>
-        <w:t>" en virtud de este contrato.</w:t>
-      </w:r>
-    </w:p>
-    <w:p>
-      <w:pPr>
-        <w:spacing w:after="0" w:line="240" w:lineRule="auto"/>
-        <w:jc w:val="both"/>
-        <w:rPr>
-          <w:rFonts w:ascii="Avenir Book" w:eastAsia="Times New Roman" w:hAnsi="Avenir Book" w:cs="Times New Roman"/>
-          <w:sz w:val="21"/>
-          <w:szCs w:val="21"/>
-          <w:lang w:eastAsia="en-US"/>
-        </w:rPr>
-      </w:pPr>
-    </w:p>
-    <w:p>
-      <w:pPr>
-        <w:spacing w:after="0" w:line="240" w:lineRule="auto"/>
-        <w:jc w:val="both"/>
-        <w:rPr>
-          <w:rFonts w:ascii="Avenir Book" w:eastAsia="Times New Roman" w:hAnsi="Avenir Book" w:cs="Times New Roman"/>
-          <w:sz w:val="21"/>
-          <w:szCs w:val="21"/>
-          <w:lang w:eastAsia="en-US"/>
-        </w:rPr>
-      </w:pPr>
-      <w:r>
-        <w:rPr>
-          <w:rFonts w:ascii="Avenir Book" w:eastAsia="Times New Roman" w:hAnsi="Avenir Book" w:cs="Times New Roman"/>
-          <w:sz w:val="21"/>
-          <w:szCs w:val="21"/>
-          <w:lang w:eastAsia="en-US"/>
-        </w:rPr>
-        <w:t>Del mismo modo, "</w:t>
-      </w:r>
-      <w:r>
-        <w:rPr>
-          <w:rFonts w:ascii="Avenir Book" w:eastAsia="Times New Roman" w:hAnsi="Avenir Book" w:cs="Times New Roman"/>
-          <w:sz w:val="21"/>
-          <w:szCs w:val="21"/>
-          <w:lang w:eastAsia="en-US"/>
-        </w:rPr>
-        <w:t>EL PRESTADOR DE SERVICIOS</w:t>
-      </w:r>
-      <w:r>
-        <w:rPr>
-          <w:rFonts w:ascii="Avenir Book" w:eastAsia="Times New Roman" w:hAnsi="Avenir Book" w:cs="Times New Roman"/>
-          <w:sz w:val="21"/>
-          <w:szCs w:val="21"/>
-          <w:lang w:eastAsia="en-US"/>
-        </w:rPr>
-        <w:t>" asume la responsabilidad de cumplir con todas las obligaciones fiscales que se deriven de los servicios prestados, de acuerdo con la legislación fiscal vigente.</w:t>
-      </w:r>
-    </w:p>
-    <w:p>
-      <w:pPr>
-        <w:spacing w:after="0" w:line="240" w:lineRule="auto"/>
-        <w:jc w:val="both"/>
-        <w:rPr>
-          <w:rFonts w:ascii="Avenir Book" w:eastAsia="Times New Roman" w:hAnsi="Avenir Book" w:cs="Times New Roman"/>
-          <w:sz w:val="21"/>
-          <w:szCs w:val="21"/>
-          <w:lang w:eastAsia="en-US"/>
-        </w:rPr>
-      </w:pPr>
-    </w:p>
-    <w:p>
-      <w:pPr>
-        <w:spacing w:after="0" w:line="240" w:lineRule="auto"/>
-        <w:jc w:val="both"/>
-        <w:rPr>
-          <w:rFonts w:ascii="Avenir Book" w:eastAsia="Times New Roman" w:hAnsi="Avenir Book" w:cs="Times New Roman"/>
-          <w:sz w:val="21"/>
-          <w:szCs w:val="21"/>
-          <w:lang w:eastAsia="en-US"/>
-        </w:rPr>
-      </w:pPr>
-      <w:r>
-        <w:rPr>
-          <w:rFonts w:ascii="Avenir Book" w:eastAsia="Times New Roman" w:hAnsi="Avenir Book" w:cs="Times New Roman"/>
-          <w:sz w:val="21"/>
-          <w:szCs w:val="21"/>
-          <w:lang w:eastAsia="en-US"/>
-        </w:rPr>
-        <w:t>Ambas partes acuerdan colaborar mutuamente para proporcionar la información y documentación necesaria en caso de requerimientos fiscales, auditorías o cualquier otro procedimiento fiscal.</w:t>
-      </w:r>
-    </w:p>
-    <w:p>
-      <w:pPr>
-        <w:spacing w:after="0" w:line="240" w:lineRule="auto"/>
-        <w:jc w:val="both"/>
-        <w:rPr>
-          <w:rFonts w:ascii="Avenir Book" w:eastAsia="Times New Roman" w:hAnsi="Avenir Book" w:cs="Times New Roman"/>
-          <w:sz w:val="21"/>
-          <w:szCs w:val="21"/>
-          <w:lang w:eastAsia="en-US"/>
-        </w:rPr>
-      </w:pPr>
-    </w:p>
-    <w:p>
-      <w:pPr>
-        <w:spacing w:after="0" w:line="240" w:lineRule="auto"/>
-        <w:jc w:val="both"/>
-        <w:rPr>
-          <w:rFonts w:ascii="Avenir Book" w:eastAsia="Times New Roman" w:hAnsi="Avenir Book" w:cs="Times New Roman"/>
-          <w:sz w:val="21"/>
-          <w:szCs w:val="21"/>
-          <w:lang w:eastAsia="en-US"/>
-        </w:rPr>
-      </w:pPr>
-      <w:r>
-        <w:rPr>
-          <w:rFonts w:ascii="Avenir Book" w:eastAsia="Times New Roman" w:hAnsi="Avenir Book" w:cs="Times New Roman"/>
-          <w:sz w:val="21"/>
-          <w:szCs w:val="21"/>
-          <w:lang w:eastAsia="en-US"/>
-        </w:rPr>
-        <w:t>Cualquier modificación en la legislación fiscal que afecte directamente a este contrato será comunicada por ambas partes de manera oportuna, buscando ajustar el cumplimiento a las nuevas disposiciones legales.</w:t>
-      </w:r>
-    </w:p>
-    <w:p>
-      <w:pPr>
-        <w:spacing w:after="0" w:line="240" w:lineRule="auto"/>
-        <w:jc w:val="both"/>
-        <w:rPr>
-          <w:rFonts w:ascii="Avenir Book" w:eastAsia="Times New Roman" w:hAnsi="Avenir Book" w:cs="Times New Roman"/>
-          <w:sz w:val="21"/>
-          <w:szCs w:val="21"/>
-          <w:lang w:eastAsia="en-US"/>
-        </w:rPr>
-      </w:pPr>
-    </w:p>
-    <w:p>
-      <w:pPr>
-        <w:spacing w:after="0" w:line="240" w:lineRule="auto"/>
-        <w:jc w:val="both"/>
-        <w:rPr>
-          <w:rFonts w:ascii="Avenir Book" w:eastAsia="Times New Roman" w:hAnsi="Avenir Book" w:cs="Times New Roman"/>
-          <w:sz w:val="21"/>
-          <w:szCs w:val="21"/>
-          <w:lang w:eastAsia="en-US"/>
-        </w:rPr>
-      </w:pPr>
-    </w:p>
-    <w:p>
-      <w:pPr>
-        <w:spacing w:after="0" w:line="240" w:lineRule="auto"/>
-        <w:jc w:val="both"/>
-        <w:rPr>
-          <w:rFonts w:ascii="Avenir Book" w:eastAsia="Times New Roman" w:hAnsi="Avenir Book" w:cs="Times New Roman"/>
-          <w:sz w:val="21"/>
-          <w:szCs w:val="21"/>
-          <w:lang w:eastAsia="en-US"/>
-        </w:rPr>
-      </w:pPr>
-    </w:p>
-    <w:p>
-      <w:pPr>
-        <w:spacing w:after="0" w:line="240" w:lineRule="auto"/>
-        <w:jc w:val="both"/>
-        <w:rPr>
-          <w:rFonts w:ascii="Avenir Book" w:eastAsia="Times New Roman" w:hAnsi="Avenir Book" w:cs="Times New Roman"/>
-          <w:sz w:val="21"/>
-          <w:szCs w:val="21"/>
-          <w:lang w:eastAsia="en-US"/>
-        </w:rPr>
-      </w:pPr>
-    </w:p>
-    <w:p>
-      <w:pPr>
-        <w:spacing w:after="0" w:line="240" w:lineRule="auto"/>
-        <w:jc w:val="both"/>
-        <w:rPr>
-          <w:rFonts w:ascii="Avenir Book" w:eastAsia="Times New Roman" w:hAnsi="Avenir Book" w:cs="Times New Roman"/>
-          <w:sz w:val="21"/>
-          <w:szCs w:val="21"/>
-          <w:lang w:eastAsia="en-US"/>
-        </w:rPr>
-      </w:pPr>
-    </w:p>
-    <w:p>
-      <w:pPr>
-        <w:spacing w:after="0" w:line="240" w:lineRule="auto"/>
-        <w:jc w:val="both"/>
-        <w:rPr>
-          <w:rFonts w:ascii="Avenir Book" w:eastAsia="Times New Roman" w:hAnsi="Avenir Book" w:cs="Times New Roman"/>
-          <w:sz w:val="21"/>
-          <w:szCs w:val="21"/>
-          <w:lang w:eastAsia="en-US"/>
-        </w:rPr>
-      </w:pPr>
-    </w:p>
-    <w:p>
-      <w:pPr>
-        <w:spacing w:after="0" w:line="240" w:lineRule="auto"/>
-        <w:jc w:val="both"/>
-        <w:rPr>
-          <w:rFonts w:ascii="Avenir Book" w:eastAsia="Times New Roman" w:hAnsi="Avenir Book" w:cs="Times New Roman"/>
-          <w:b/>
-          <w:sz w:val="21"/>
-          <w:szCs w:val="21"/>
-          <w:lang w:eastAsia="en-US"/>
-        </w:rPr>
-      </w:pPr>
-      <w:r>
-        <w:rPr>
-          <w:rFonts w:ascii="Avenir Book" w:eastAsia="Times New Roman" w:hAnsi="Avenir Book" w:cs="Times New Roman"/>
-          <w:b/>
-          <w:sz w:val="21"/>
-          <w:szCs w:val="21"/>
-          <w:lang w:eastAsia="en-US"/>
-        </w:rPr>
-        <w:t xml:space="preserve">OCTAVA. - VIGENCIA. </w:t>
-      </w:r>
-    </w:p>
-    <w:p>
-      <w:pPr>
-        <w:spacing w:after="0" w:line="240" w:lineRule="auto"/>
-        <w:jc w:val="both"/>
-        <w:rPr>
-          <w:rFonts w:ascii="Avenir Book" w:eastAsia="Times New Roman" w:hAnsi="Avenir Book" w:cs="Times New Roman"/>
-          <w:sz w:val="21"/>
-          <w:szCs w:val="21"/>
-          <w:lang w:eastAsia="en-US"/>
-        </w:rPr>
-      </w:pPr>
-    </w:p>
-    <w:p>
-      <w:pPr>
-        <w:spacing w:after="0" w:line="240" w:lineRule="auto"/>
-        <w:jc w:val="both"/>
-        <w:rPr>
-          <w:rFonts w:ascii="Avenir Book" w:eastAsia="Times New Roman" w:hAnsi="Avenir Book" w:cs="Times New Roman"/>
-          <w:sz w:val="21"/>
-          <w:szCs w:val="21"/>
-          <w:lang w:eastAsia="en-US"/>
-        </w:rPr>
-      </w:pPr>
-      <w:r>
-        <w:rPr>
-          <w:rFonts w:ascii="Avenir Book" w:eastAsia="Times New Roman" w:hAnsi="Avenir Book" w:cs="Times New Roman"/>
-          <w:sz w:val="21"/>
-          <w:szCs w:val="21"/>
-          <w:lang w:eastAsia="en-US"/>
-        </w:rPr>
-        <w:t xml:space="preserve">“LAS PARTES” convienen que la duración del presente contrato será de 1 (uno) año el cual iniciará surtiendo sus efectos a partir del día </w:t>
-      </w:r>
-      <w:r>
-        <w:rPr>
-          <w:rFonts w:ascii="Avenir Book" w:eastAsia="Times New Roman" w:hAnsi="Avenir Book" w:cs="Times New Roman"/>
-          <w:color w:val="FF0000"/>
-          <w:sz w:val="21"/>
-          <w:szCs w:val="21"/>
-          <w:lang w:eastAsia="en-US"/>
-        </w:rPr>
-        <w:t>{{V</w:t>
-      </w:r>
-      <w:r>
-        <w:rPr>
-          <w:rFonts w:ascii="Avenir Book" w:eastAsia="Times New Roman" w:hAnsi="Avenir Book" w:cs="Times New Roman"/>
-          <w:color w:val="FF0000"/>
-          <w:sz w:val="21"/>
-          <w:szCs w:val="21"/>
-          <w:lang w:eastAsia="en-US"/>
-        </w:rPr>
-        <w:t>ID}}</w:t>
-      </w:r>
-      <w:r>
-        <w:rPr>
-          <w:rFonts w:ascii="Avenir Book" w:eastAsia="Times New Roman" w:hAnsi="Avenir Book" w:cs="Times New Roman"/>
-          <w:sz w:val="21"/>
-          <w:szCs w:val="21"/>
-          <w:lang w:eastAsia="en-US"/>
-        </w:rPr>
-        <w:t xml:space="preserve"> de </w:t>
-      </w:r>
-      <w:r>
-        <w:rPr>
-          <w:rFonts w:ascii="Avenir Book" w:eastAsia="Times New Roman" w:hAnsi="Avenir Book" w:cs="Times New Roman"/>
-          <w:color w:val="FF0000"/>
-          <w:sz w:val="21"/>
-          <w:szCs w:val="21"/>
-          <w:lang w:eastAsia="en-US"/>
-        </w:rPr>
-        <w:t>{{VI</w:t>
-      </w:r>
-      <w:r>
-        <w:rPr>
-          <w:rFonts w:ascii="Avenir Book" w:eastAsia="Times New Roman" w:hAnsi="Avenir Book" w:cs="Times New Roman"/>
-          <w:color w:val="FF0000"/>
-          <w:sz w:val="21"/>
-          <w:szCs w:val="21"/>
-          <w:lang w:eastAsia="en-US"/>
-        </w:rPr>
-        <w:t>M</w:t>
-      </w:r>
-      <w:r>
-        <w:rPr>
-          <w:rFonts w:ascii="Avenir Book" w:eastAsia="Times New Roman" w:hAnsi="Avenir Book" w:cs="Times New Roman"/>
-          <w:color w:val="FF0000"/>
-          <w:sz w:val="21"/>
-          <w:szCs w:val="21"/>
-          <w:lang w:eastAsia="en-US"/>
-        </w:rPr>
-        <w:t>}}</w:t>
-      </w:r>
-      <w:r>
-        <w:rPr>
-          <w:rFonts w:ascii="Avenir Book" w:eastAsia="Times New Roman" w:hAnsi="Avenir Book" w:cs="Times New Roman"/>
-          <w:sz w:val="21"/>
-          <w:szCs w:val="21"/>
-          <w:lang w:eastAsia="en-US"/>
-        </w:rPr>
-        <w:t xml:space="preserve"> del año </w:t>
-      </w:r>
-      <w:r>
-        <w:rPr>
-          <w:rFonts w:ascii="Avenir Book" w:eastAsia="Times New Roman" w:hAnsi="Avenir Book" w:cs="Times New Roman"/>
-          <w:color w:val="FF0000"/>
-          <w:sz w:val="21"/>
-          <w:szCs w:val="21"/>
-          <w:lang w:eastAsia="en-US"/>
-        </w:rPr>
-        <w:t>{{VI</w:t>
-      </w:r>
-      <w:r>
-        <w:rPr>
-          <w:rFonts w:ascii="Avenir Book" w:eastAsia="Times New Roman" w:hAnsi="Avenir Book" w:cs="Times New Roman"/>
-          <w:color w:val="FF0000"/>
-          <w:sz w:val="21"/>
-          <w:szCs w:val="21"/>
-          <w:lang w:eastAsia="en-US"/>
-        </w:rPr>
-        <w:t>A</w:t>
-      </w:r>
-      <w:r>
-        <w:rPr>
-          <w:rFonts w:ascii="Avenir Book" w:eastAsia="Times New Roman" w:hAnsi="Avenir Book" w:cs="Times New Roman"/>
-          <w:color w:val="FF0000"/>
-          <w:sz w:val="21"/>
-          <w:szCs w:val="21"/>
-          <w:lang w:eastAsia="en-US"/>
-        </w:rPr>
-        <w:t>}}</w:t>
-      </w:r>
-      <w:r>
-        <w:rPr>
-          <w:rFonts w:ascii="Avenir Book" w:eastAsia="Times New Roman" w:hAnsi="Avenir Book" w:cs="Times New Roman"/>
-          <w:sz w:val="21"/>
-          <w:szCs w:val="21"/>
-          <w:lang w:eastAsia="en-US"/>
-        </w:rPr>
-        <w:t xml:space="preserve"> y terminando precisamente el día </w:t>
-      </w:r>
-      <w:r>
-        <w:rPr>
-          <w:rFonts w:ascii="Avenir Book" w:eastAsia="Times New Roman" w:hAnsi="Avenir Book" w:cs="Times New Roman"/>
-          <w:color w:val="FF0000"/>
-          <w:sz w:val="21"/>
-          <w:szCs w:val="21"/>
-          <w:lang w:eastAsia="en-US"/>
-        </w:rPr>
-        <w:t>{{V</w:t>
-      </w:r>
-      <w:r>
-        <w:rPr>
-          <w:rFonts w:ascii="Avenir Book" w:eastAsia="Times New Roman" w:hAnsi="Avenir Book" w:cs="Times New Roman"/>
-          <w:color w:val="FF0000"/>
-          <w:sz w:val="21"/>
-          <w:szCs w:val="21"/>
-          <w:lang w:eastAsia="en-US"/>
-        </w:rPr>
-        <w:t>T</w:t>
-      </w:r>
-      <w:r>
-        <w:rPr>
-          <w:rFonts w:ascii="Avenir Book" w:eastAsia="Times New Roman" w:hAnsi="Avenir Book" w:cs="Times New Roman"/>
-          <w:color w:val="FF0000"/>
-          <w:sz w:val="21"/>
-          <w:szCs w:val="21"/>
-          <w:lang w:eastAsia="en-US"/>
-        </w:rPr>
-        <w:t>D}}</w:t>
-      </w:r>
-      <w:r>
-        <w:rPr>
-          <w:rFonts w:ascii="Avenir Book" w:eastAsia="Times New Roman" w:hAnsi="Avenir Book" w:cs="Times New Roman"/>
-          <w:sz w:val="21"/>
-          <w:szCs w:val="21"/>
-          <w:lang w:eastAsia="en-US"/>
-        </w:rPr>
-        <w:t xml:space="preserve"> de </w:t>
-      </w:r>
-      <w:r>
-        <w:rPr>
-          <w:rFonts w:ascii="Avenir Book" w:eastAsia="Times New Roman" w:hAnsi="Avenir Book" w:cs="Times New Roman"/>
-          <w:color w:val="FF0000"/>
-          <w:sz w:val="21"/>
-          <w:szCs w:val="21"/>
-          <w:lang w:eastAsia="en-US"/>
-        </w:rPr>
-        <w:t>{{V</w:t>
-      </w:r>
-      <w:r>
-        <w:rPr>
-          <w:rFonts w:ascii="Avenir Book" w:eastAsia="Times New Roman" w:hAnsi="Avenir Book" w:cs="Times New Roman"/>
-          <w:color w:val="FF0000"/>
-          <w:sz w:val="21"/>
-          <w:szCs w:val="21"/>
-          <w:lang w:eastAsia="en-US"/>
-        </w:rPr>
-        <w:t>TM</w:t>
-      </w:r>
-      <w:r>
-        <w:rPr>
-          <w:rFonts w:ascii="Avenir Book" w:eastAsia="Times New Roman" w:hAnsi="Avenir Book" w:cs="Times New Roman"/>
-          <w:color w:val="FF0000"/>
-          <w:sz w:val="21"/>
-          <w:szCs w:val="21"/>
-          <w:lang w:eastAsia="en-US"/>
-        </w:rPr>
-        <w:t>}}</w:t>
-      </w:r>
-      <w:r>
-        <w:rPr>
-          <w:rFonts w:ascii="Avenir Book" w:eastAsia="Times New Roman" w:hAnsi="Avenir Book" w:cs="Times New Roman"/>
-          <w:sz w:val="21"/>
-          <w:szCs w:val="21"/>
-          <w:lang w:eastAsia="en-US"/>
-        </w:rPr>
-        <w:t xml:space="preserve"> del año </w:t>
-      </w:r>
-      <w:r>
-        <w:rPr>
-          <w:rFonts w:ascii="Avenir Book" w:eastAsia="Times New Roman" w:hAnsi="Avenir Book" w:cs="Times New Roman"/>
-          <w:color w:val="FF0000"/>
-          <w:sz w:val="21"/>
-          <w:szCs w:val="21"/>
-          <w:lang w:eastAsia="en-US"/>
-        </w:rPr>
-        <w:t>{{V</w:t>
-      </w:r>
-      <w:r>
-        <w:rPr>
-          <w:rFonts w:ascii="Avenir Book" w:eastAsia="Times New Roman" w:hAnsi="Avenir Book" w:cs="Times New Roman"/>
-          <w:color w:val="FF0000"/>
-          <w:sz w:val="21"/>
-          <w:szCs w:val="21"/>
-          <w:lang w:eastAsia="en-US"/>
-        </w:rPr>
-        <w:t>TA</w:t>
-      </w:r>
-      <w:r>
-        <w:rPr>
-          <w:rFonts w:ascii="Avenir Book" w:eastAsia="Times New Roman" w:hAnsi="Avenir Book" w:cs="Times New Roman"/>
-          <w:color w:val="FF0000"/>
-          <w:sz w:val="21"/>
-          <w:szCs w:val="21"/>
-          <w:lang w:eastAsia="en-US"/>
-        </w:rPr>
-        <w:t>}}</w:t>
-      </w:r>
-      <w:r>
-        <w:rPr>
-          <w:rFonts w:ascii="Avenir Book" w:eastAsia="Times New Roman" w:hAnsi="Avenir Book" w:cs="Times New Roman"/>
-          <w:sz w:val="21"/>
-          <w:szCs w:val="21"/>
-          <w:lang w:eastAsia="en-US"/>
-        </w:rPr>
-        <w:t>.</w:t>
-      </w:r>
-    </w:p>
-    <w:p>
-      <w:pPr>
-        <w:spacing w:after="0" w:line="240" w:lineRule="auto"/>
-        <w:jc w:val="both"/>
-        <w:rPr>
-          <w:rFonts w:ascii="Avenir Book" w:eastAsia="Times New Roman" w:hAnsi="Avenir Book" w:cs="Times New Roman"/>
-          <w:sz w:val="21"/>
-          <w:szCs w:val="21"/>
-          <w:lang w:eastAsia="en-US"/>
-        </w:rPr>
-      </w:pPr>
-    </w:p>
-    <w:p>
-      <w:pPr>
-        <w:spacing w:after="0" w:line="240" w:lineRule="auto"/>
-        <w:jc w:val="both"/>
-        <w:rPr>
-          <w:rFonts w:ascii="Avenir Book" w:eastAsia="Times New Roman" w:hAnsi="Avenir Book" w:cs="Times New Roman"/>
-          <w:sz w:val="21"/>
-          <w:szCs w:val="21"/>
-          <w:lang w:eastAsia="en-US"/>
-        </w:rPr>
-      </w:pPr>
-      <w:r>
-        <w:rPr>
-          <w:rFonts w:ascii="Avenir Book" w:eastAsia="Times New Roman" w:hAnsi="Avenir Book" w:cs="Times New Roman"/>
-          <w:sz w:val="21"/>
-          <w:szCs w:val="21"/>
-          <w:lang w:eastAsia="en-US"/>
-        </w:rPr>
-        <w:t>El presente contrato terminará al momento de que finalice su vigencia, o bien, que alguna de las partes opte por la terminación anticipada del mismo, la cual se detalla en la cláusula inmediata siguiente.</w:t>
-      </w:r>
-    </w:p>
-    <w:p>
-      <w:pPr>
-        <w:spacing w:after="0" w:line="240" w:lineRule="auto"/>
-        <w:jc w:val="both"/>
-        <w:rPr>
-          <w:rFonts w:ascii="Avenir Book" w:eastAsia="Times New Roman" w:hAnsi="Avenir Book" w:cs="Times New Roman"/>
-          <w:sz w:val="21"/>
-          <w:szCs w:val="21"/>
-          <w:lang w:eastAsia="en-US"/>
-        </w:rPr>
-      </w:pPr>
-    </w:p>
-    <w:p>
-      <w:pPr>
-        <w:spacing w:after="0" w:line="240" w:lineRule="auto"/>
-        <w:jc w:val="both"/>
-        <w:rPr>
-          <w:rFonts w:ascii="Avenir Book" w:eastAsia="Times New Roman" w:hAnsi="Avenir Book" w:cs="Times New Roman"/>
-          <w:b/>
-          <w:color w:val="000000"/>
-          <w:sz w:val="21"/>
-          <w:szCs w:val="21"/>
-          <w:lang w:eastAsia="en-US"/>
-        </w:rPr>
-      </w:pPr>
-      <w:r>
-        <w:rPr>
-          <w:rFonts w:ascii="Avenir Book" w:eastAsia="Times New Roman" w:hAnsi="Avenir Book" w:cs="Times New Roman"/>
-          <w:b/>
-          <w:sz w:val="21"/>
-          <w:szCs w:val="21"/>
-          <w:lang w:eastAsia="en-US"/>
-        </w:rPr>
-        <w:t xml:space="preserve">NOVENA. - </w:t>
-      </w:r>
-      <w:r>
-        <w:rPr>
-          <w:rFonts w:ascii="Avenir Book" w:eastAsia="Times New Roman" w:hAnsi="Avenir Book" w:cs="Times New Roman"/>
-          <w:b/>
-          <w:color w:val="000000"/>
-          <w:sz w:val="21"/>
-          <w:szCs w:val="21"/>
-          <w:lang w:eastAsia="en-US"/>
-        </w:rPr>
-        <w:t xml:space="preserve">TERMINACIÓN ANTICIPADA. </w:t>
-      </w:r>
-    </w:p>
-    <w:p>
-      <w:pPr>
-        <w:spacing w:after="0" w:line="240" w:lineRule="auto"/>
-        <w:jc w:val="both"/>
-        <w:rPr>
-          <w:rFonts w:ascii="Avenir Book" w:eastAsia="Times New Roman" w:hAnsi="Avenir Book" w:cs="Times New Roman"/>
-          <w:b/>
-          <w:color w:val="000000"/>
-          <w:sz w:val="21"/>
-          <w:szCs w:val="21"/>
-          <w:lang w:eastAsia="en-US"/>
-        </w:rPr>
-      </w:pPr>
-    </w:p>
-    <w:p>
-      <w:pPr>
-        <w:spacing w:after="0" w:line="240" w:lineRule="auto"/>
-        <w:jc w:val="both"/>
-        <w:rPr>
-          <w:rFonts w:ascii="Avenir Book" w:eastAsia="Times New Roman" w:hAnsi="Avenir Book" w:cs="Times New Roman"/>
-          <w:sz w:val="21"/>
-          <w:szCs w:val="21"/>
-          <w:lang w:eastAsia="en-US"/>
-        </w:rPr>
-      </w:pPr>
-      <w:r>
-        <w:rPr>
-          <w:rFonts w:ascii="Avenir Book" w:eastAsia="Times New Roman" w:hAnsi="Avenir Book" w:cs="Times New Roman"/>
-          <w:sz w:val="21"/>
-          <w:szCs w:val="21"/>
-          <w:lang w:eastAsia="en-US"/>
-        </w:rPr>
-        <w:t xml:space="preserve">Para en caso de que alguna de “LAS PARTES” quisiera dar por terminado el presente contrato antes de la fecha de su terminación, deberá de notificarlo a la otra con por lo menos 60 sesenta días de anticipación a la fecha en la que pretenda dar por concluida la relación contractual. </w:t>
-      </w:r>
-    </w:p>
-    <w:p>
-      <w:pPr>
-        <w:spacing w:after="0" w:line="240" w:lineRule="auto"/>
-        <w:jc w:val="both"/>
-        <w:rPr>
-          <w:rFonts w:ascii="Avenir Book" w:eastAsia="Times New Roman" w:hAnsi="Avenir Book" w:cs="Times New Roman"/>
-          <w:sz w:val="21"/>
-          <w:szCs w:val="21"/>
-          <w:lang w:eastAsia="en-US"/>
-        </w:rPr>
-      </w:pPr>
-    </w:p>
-    <w:p>
-      <w:pPr>
-        <w:spacing w:after="0" w:line="240" w:lineRule="auto"/>
-        <w:jc w:val="both"/>
-        <w:rPr>
-          <w:rFonts w:ascii="Avenir Book" w:eastAsia="Times New Roman" w:hAnsi="Avenir Book" w:cs="Times New Roman"/>
-          <w:sz w:val="21"/>
-          <w:szCs w:val="21"/>
-          <w:lang w:eastAsia="en-US"/>
-        </w:rPr>
-      </w:pPr>
-      <w:r>
-        <w:rPr>
-          <w:rFonts w:ascii="Avenir Book" w:eastAsia="Times New Roman" w:hAnsi="Avenir Book" w:cs="Times New Roman"/>
-          <w:sz w:val="21"/>
-          <w:szCs w:val="21"/>
-          <w:lang w:eastAsia="en-US"/>
-        </w:rPr>
-        <w:t>Adicional a lo anterior, la parte que solicite la terminación anticipada el presente instrumento, deberá de pagar a la parte afectada una pena convencional consistente en la cantidad que resulte de sacar el promedio de la comisión pagada los últimos 6 seis meses, multiplicada por tres, más el correspondiente Impuesto al Valor Agregado; haciéndose la especificación relativa a que dichas cantidades serán independientes a las que en su caso se adeuden por “</w:t>
-      </w:r>
-      <w:r>
-        <w:rPr>
-          <w:rFonts w:ascii="Avenir Book" w:eastAsia="Times New Roman" w:hAnsi="Avenir Book" w:cs="Times New Roman"/>
-          <w:color w:val="FF0000"/>
-          <w:sz w:val="21"/>
-          <w:szCs w:val="21"/>
-          <w:lang w:eastAsia="en-US"/>
-        </w:rPr>
-        <w:t>{{EL_CLIENTE}}</w:t>
-      </w:r>
-      <w:r>
-        <w:rPr>
-          <w:rFonts w:ascii="Avenir Book" w:eastAsia="Times New Roman" w:hAnsi="Avenir Book" w:cs="Times New Roman"/>
-          <w:sz w:val="21"/>
-          <w:szCs w:val="21"/>
-          <w:lang w:eastAsia="en-US"/>
-        </w:rPr>
-        <w:t>” con motivo de la prestación de los servicios a los que se aluden en la cláusula identificada como PRIMERA del presente acuerdo de voluntades.</w:t>
-      </w:r>
-    </w:p>
-    <w:p>
-      <w:pPr>
-        <w:spacing w:after="0" w:line="240" w:lineRule="auto"/>
-        <w:jc w:val="both"/>
-        <w:rPr>
-          <w:rFonts w:ascii="Avenir Book" w:eastAsia="Times New Roman" w:hAnsi="Avenir Book" w:cs="Times New Roman"/>
-          <w:sz w:val="21"/>
-          <w:szCs w:val="21"/>
-          <w:lang w:eastAsia="en-US"/>
-        </w:rPr>
-      </w:pPr>
-    </w:p>
-    <w:p>
-      <w:pPr>
-        <w:spacing w:after="0" w:line="240" w:lineRule="auto"/>
-        <w:jc w:val="both"/>
-        <w:rPr>
-          <w:rFonts w:ascii="Avenir Book" w:eastAsia="Times New Roman" w:hAnsi="Avenir Book" w:cs="Times New Roman"/>
-          <w:sz w:val="21"/>
-          <w:szCs w:val="21"/>
-          <w:lang w:eastAsia="en-US"/>
-        </w:rPr>
-      </w:pPr>
-      <w:r>
-        <w:rPr>
-          <w:rFonts w:ascii="Avenir Book" w:eastAsia="Times New Roman" w:hAnsi="Avenir Book" w:cs="Times New Roman"/>
-          <w:sz w:val="21"/>
-          <w:szCs w:val="21"/>
-          <w:lang w:eastAsia="en-US"/>
-        </w:rPr>
-        <w:t>Ahora bien, para en caso de que exista un saldo a favor del “CLIENTE” del fondo de compensaciones de salud en el trabajo y opere la terminación anticipada del presente contrato, “</w:t>
-      </w:r>
-      <w:r>
-        <w:rPr>
-          <w:rFonts w:ascii="Avenir Book" w:eastAsia="Times New Roman" w:hAnsi="Avenir Book" w:cs="Times New Roman"/>
-          <w:sz w:val="21"/>
-          <w:szCs w:val="21"/>
-          <w:lang w:eastAsia="en-US"/>
-        </w:rPr>
-        <w:t>EL PRESTADOR DE SERVICIOS</w:t>
-      </w:r>
-      <w:r>
-        <w:rPr>
-          <w:rFonts w:ascii="Avenir Book" w:eastAsia="Times New Roman" w:hAnsi="Avenir Book" w:cs="Times New Roman"/>
-          <w:sz w:val="21"/>
-          <w:szCs w:val="21"/>
-          <w:lang w:eastAsia="en-US"/>
-        </w:rPr>
         <w:t>” deberá hacer la devolución correspondiente de los recursos al “CLIENTE” en un plazo máximo de 10 diez días hábiles, devolución que se hará a la cuenta bancaria que indique este último para tal efecto; desde este momento, “</w:t>
       </w:r>
       <w:r>
         <w:rPr>
           <w:rFonts w:ascii="Avenir Book" w:eastAsia="Times New Roman" w:hAnsi="Avenir Book" w:cs="Times New Roman"/>
-          <w:color w:val="FF0000"/>
-          <w:sz w:val="21"/>
-          <w:szCs w:val="21"/>
-          <w:lang w:eastAsia="en-US"/>
-        </w:rPr>
-        <w:t>{{EL_CLIENTE}}</w:t>
+          <w:sz w:val="21"/>
+          <w:szCs w:val="21"/>
+          <w:lang w:eastAsia="en-US"/>
+        </w:rPr>
+        <w:t>EL CLIENTE</w:t>
       </w:r>
       <w:r>
         <w:rPr>
@@ -5481,7 +5634,6 @@
         <w:jc w:val="both"/>
         <w:rPr>
           <w:rFonts w:ascii="Avenir Book" w:eastAsia="Times New Roman" w:hAnsi="Avenir Book" w:cs="Times New Roman"/>
-          <w:color w:val="000080"/>
           <w:sz w:val="21"/>
           <w:szCs w:val="21"/>
           <w:lang w:eastAsia="en-US"/>
@@ -5507,7 +5659,6 @@
         <w:jc w:val="both"/>
         <w:rPr>
           <w:rFonts w:ascii="Avenir Book" w:eastAsia="Times New Roman" w:hAnsi="Avenir Book" w:cs="Times New Roman"/>
-          <w:color w:val="000080"/>
           <w:sz w:val="21"/>
           <w:szCs w:val="21"/>
           <w:lang w:eastAsia="en-US"/>
@@ -5533,7 +5684,6 @@
         <w:jc w:val="both"/>
         <w:rPr>
           <w:rFonts w:ascii="Avenir Book" w:eastAsia="Times New Roman" w:hAnsi="Avenir Book" w:cs="Times New Roman"/>
-          <w:color w:val="000080"/>
           <w:sz w:val="21"/>
           <w:szCs w:val="21"/>
           <w:lang w:eastAsia="en-US"/>
@@ -5551,12 +5701,11 @@
       <w:r>
         <w:rPr>
           <w:rFonts w:ascii="Avenir Book" w:eastAsia="Times New Roman" w:hAnsi="Avenir Book" w:cs="Times New Roman"/>
-          <w:color w:val="FF0000"/>
-          <w:sz w:val="21"/>
-          <w:szCs w:val="21"/>
-          <w:lang w:eastAsia="en-US"/>
-        </w:rPr>
-        <w:t>{{EL_CLIENTE}}</w:t>
+          <w:sz w:val="21"/>
+          <w:szCs w:val="21"/>
+          <w:lang w:eastAsia="en-US"/>
+        </w:rPr>
+        <w:t>EL CLIENTE</w:t>
       </w:r>
       <w:r>
         <w:rPr>
@@ -5578,7 +5727,6 @@
         <w:jc w:val="both"/>
         <w:rPr>
           <w:rFonts w:ascii="Avenir Book" w:eastAsia="Times New Roman" w:hAnsi="Avenir Book" w:cs="Times New Roman"/>
-          <w:color w:val="000080"/>
           <w:sz w:val="21"/>
           <w:szCs w:val="21"/>
           <w:lang w:eastAsia="en-US"/>
@@ -5604,7 +5752,6 @@
         <w:jc w:val="both"/>
         <w:rPr>
           <w:rFonts w:ascii="Avenir Book" w:eastAsia="Times New Roman" w:hAnsi="Avenir Book" w:cs="Times New Roman"/>
-          <w:color w:val="000080"/>
           <w:sz w:val="21"/>
           <w:szCs w:val="21"/>
           <w:lang w:eastAsia="en-US"/>
@@ -5630,7 +5777,6 @@
         <w:jc w:val="both"/>
         <w:rPr>
           <w:rFonts w:ascii="Avenir Book" w:eastAsia="Times New Roman" w:hAnsi="Avenir Book" w:cs="Times New Roman"/>
-          <w:color w:val="000080"/>
           <w:sz w:val="21"/>
           <w:szCs w:val="21"/>
           <w:lang w:eastAsia="en-US"/>
@@ -5648,12 +5794,11 @@
       <w:r>
         <w:rPr>
           <w:rFonts w:ascii="Avenir Book" w:eastAsia="Times New Roman" w:hAnsi="Avenir Book" w:cs="Times New Roman"/>
-          <w:color w:val="FF0000"/>
-          <w:sz w:val="21"/>
-          <w:szCs w:val="21"/>
-          <w:lang w:eastAsia="en-US"/>
-        </w:rPr>
-        <w:t>{{EL_CLIENTE}}</w:t>
+          <w:sz w:val="21"/>
+          <w:szCs w:val="21"/>
+          <w:lang w:eastAsia="en-US"/>
+        </w:rPr>
+        <w:t>EL CLIENTE</w:t>
       </w:r>
       <w:r>
         <w:rPr>
@@ -5675,7 +5820,6 @@
         <w:jc w:val="both"/>
         <w:rPr>
           <w:rFonts w:ascii="Avenir Book" w:eastAsia="Times New Roman" w:hAnsi="Avenir Book" w:cs="Times New Roman"/>
-          <w:color w:val="000080"/>
           <w:sz w:val="21"/>
           <w:szCs w:val="21"/>
           <w:lang w:eastAsia="en-US"/>
@@ -5726,12 +5870,11 @@
       <w:r>
         <w:rPr>
           <w:rFonts w:ascii="Avenir Book" w:eastAsia="Times New Roman" w:hAnsi="Avenir Book" w:cs="Times New Roman"/>
-          <w:color w:val="FF0000"/>
-          <w:sz w:val="21"/>
-          <w:szCs w:val="21"/>
-          <w:lang w:eastAsia="en-US"/>
-        </w:rPr>
-        <w:t>{{EL_CLIENTE}}</w:t>
+          <w:sz w:val="21"/>
+          <w:szCs w:val="21"/>
+          <w:lang w:eastAsia="en-US"/>
+        </w:rPr>
+        <w:t>EL CLIENTE</w:t>
       </w:r>
       <w:r>
         <w:rPr>
@@ -5765,7 +5908,6 @@
         <w:jc w:val="both"/>
         <w:rPr>
           <w:rFonts w:ascii="Avenir Book" w:eastAsia="Times New Roman" w:hAnsi="Avenir Book" w:cs="Times New Roman"/>
-          <w:color w:val="000080"/>
           <w:sz w:val="21"/>
           <w:szCs w:val="21"/>
           <w:lang w:eastAsia="en-US"/>
@@ -5791,7 +5933,6 @@
         <w:jc w:val="both"/>
         <w:rPr>
           <w:rFonts w:ascii="Avenir Book" w:eastAsia="Times New Roman" w:hAnsi="Avenir Book" w:cs="Times New Roman"/>
-          <w:color w:val="000080"/>
           <w:sz w:val="21"/>
           <w:szCs w:val="21"/>
           <w:lang w:eastAsia="en-US"/>
@@ -5817,7 +5958,6 @@
         <w:jc w:val="both"/>
         <w:rPr>
           <w:rFonts w:ascii="Avenir Book" w:eastAsia="Times New Roman" w:hAnsi="Avenir Book" w:cs="Times New Roman"/>
-          <w:color w:val="000080"/>
           <w:sz w:val="21"/>
           <w:szCs w:val="21"/>
           <w:lang w:eastAsia="en-US"/>
@@ -5861,7 +6001,6 @@
         <w:jc w:val="both"/>
         <w:rPr>
           <w:rFonts w:ascii="Avenir Book" w:eastAsia="Times New Roman" w:hAnsi="Avenir Book" w:cs="Times New Roman"/>
-          <w:color w:val="000080"/>
           <w:sz w:val="21"/>
           <w:szCs w:val="21"/>
           <w:lang w:eastAsia="en-US"/>
@@ -5879,12 +6018,11 @@
       <w:r>
         <w:rPr>
           <w:rFonts w:ascii="Avenir Book" w:eastAsia="Times New Roman" w:hAnsi="Avenir Book" w:cs="Times New Roman"/>
-          <w:color w:val="FF0000"/>
-          <w:sz w:val="21"/>
-          <w:szCs w:val="21"/>
-          <w:lang w:eastAsia="en-US"/>
-        </w:rPr>
-        <w:t>{{EL_CLIENTE}}</w:t>
+          <w:sz w:val="21"/>
+          <w:szCs w:val="21"/>
+          <w:lang w:eastAsia="en-US"/>
+        </w:rPr>
+        <w:t>EL CLIENTE</w:t>
       </w:r>
       <w:r>
         <w:rPr>
@@ -5924,7 +6062,6 @@
         <w:jc w:val="both"/>
         <w:rPr>
           <w:rFonts w:ascii="Avenir Book" w:eastAsia="Times New Roman" w:hAnsi="Avenir Book" w:cs="Times New Roman"/>
-          <w:color w:val="000080"/>
           <w:sz w:val="21"/>
           <w:szCs w:val="21"/>
           <w:lang w:eastAsia="en-US"/>
@@ -5968,7 +6105,6 @@
         <w:jc w:val="both"/>
         <w:rPr>
           <w:rFonts w:ascii="Avenir Book" w:eastAsia="Times New Roman" w:hAnsi="Avenir Book" w:cs="Times New Roman"/>
-          <w:color w:val="000080"/>
           <w:sz w:val="21"/>
           <w:szCs w:val="21"/>
           <w:lang w:eastAsia="en-US"/>
@@ -6111,12 +6247,11 @@
       <w:r>
         <w:rPr>
           <w:rFonts w:ascii="Avenir Book" w:eastAsia="Times New Roman" w:hAnsi="Avenir Book" w:cs="Times New Roman"/>
-          <w:color w:val="FF0000"/>
-          <w:sz w:val="21"/>
-          <w:szCs w:val="21"/>
-          <w:lang w:eastAsia="en-US"/>
-        </w:rPr>
-        <w:t>{{EL_CLIENTE}}</w:t>
+          <w:sz w:val="21"/>
+          <w:szCs w:val="21"/>
+          <w:lang w:eastAsia="en-US"/>
+        </w:rPr>
+        <w:t>EL CLIENTE</w:t>
       </w:r>
       <w:r>
         <w:rPr>
@@ -6155,12 +6290,11 @@
       <w:r>
         <w:rPr>
           <w:rFonts w:ascii="Avenir Book" w:eastAsia="Times New Roman" w:hAnsi="Avenir Book" w:cs="Times New Roman"/>
-          <w:color w:val="FF0000"/>
-          <w:sz w:val="21"/>
-          <w:szCs w:val="21"/>
-          <w:lang w:eastAsia="en-US"/>
-        </w:rPr>
-        <w:t>{{EL_CLIENTE}}</w:t>
+          <w:sz w:val="21"/>
+          <w:szCs w:val="21"/>
+          <w:lang w:eastAsia="en-US"/>
+        </w:rPr>
+        <w:t>EL CLIENTE</w:t>
       </w:r>
       <w:r>
         <w:rPr>
@@ -6199,12 +6333,11 @@
       <w:r>
         <w:rPr>
           <w:rFonts w:ascii="Avenir Book" w:eastAsia="Times New Roman" w:hAnsi="Avenir Book" w:cs="Times New Roman"/>
-          <w:color w:val="FF0000"/>
-          <w:sz w:val="21"/>
-          <w:szCs w:val="21"/>
-          <w:lang w:eastAsia="en-US"/>
-        </w:rPr>
-        <w:t>{{EL_CLIENTE}}</w:t>
+          <w:sz w:val="21"/>
+          <w:szCs w:val="21"/>
+          <w:lang w:eastAsia="en-US"/>
+        </w:rPr>
+        <w:t>EL CLIENTE</w:t>
       </w:r>
       <w:r>
         <w:rPr>
@@ -6269,12 +6402,11 @@
       <w:r>
         <w:rPr>
           <w:rFonts w:ascii="Avenir Book" w:eastAsia="Times New Roman" w:hAnsi="Avenir Book" w:cs="Times New Roman"/>
-          <w:color w:val="FF0000"/>
-          <w:sz w:val="21"/>
-          <w:szCs w:val="21"/>
-          <w:lang w:eastAsia="en-US"/>
-        </w:rPr>
-        <w:t>{{EL_CLIENTE}}</w:t>
+          <w:sz w:val="21"/>
+          <w:szCs w:val="21"/>
+          <w:lang w:eastAsia="en-US"/>
+        </w:rPr>
+        <w:t>EL CLIENTE</w:t>
       </w:r>
       <w:r>
         <w:rPr>
@@ -6339,12 +6471,11 @@
       <w:r>
         <w:rPr>
           <w:rFonts w:ascii="Avenir Book" w:eastAsia="Times New Roman" w:hAnsi="Avenir Book" w:cs="Times New Roman"/>
-          <w:color w:val="FF0000"/>
-          <w:sz w:val="21"/>
-          <w:szCs w:val="21"/>
-          <w:lang w:eastAsia="en-US"/>
-        </w:rPr>
-        <w:t>{{EL_CLIENTE}}</w:t>
+          <w:sz w:val="21"/>
+          <w:szCs w:val="21"/>
+          <w:lang w:eastAsia="en-US"/>
+        </w:rPr>
+        <w:t>EL CLIENTE</w:t>
       </w:r>
       <w:r>
         <w:rPr>
@@ -6676,12 +6807,11 @@
       <w:r>
         <w:rPr>
           <w:rFonts w:ascii="Avenir Book" w:eastAsia="Times New Roman" w:hAnsi="Avenir Book" w:cs="Times New Roman"/>
-          <w:color w:val="FF0000"/>
-          <w:sz w:val="21"/>
-          <w:szCs w:val="21"/>
-          <w:lang w:eastAsia="en-US"/>
-        </w:rPr>
-        <w:t>{{EL_CLIENTE}}</w:t>
+          <w:sz w:val="21"/>
+          <w:szCs w:val="21"/>
+          <w:lang w:eastAsia="en-US"/>
+        </w:rPr>
+        <w:t>EL CLIENTE</w:t>
       </w:r>
       <w:r>
         <w:rPr>
@@ -6747,12 +6877,11 @@
       <w:r>
         <w:rPr>
           <w:rFonts w:ascii="Avenir Book" w:eastAsia="Times New Roman" w:hAnsi="Avenir Book" w:cs="Times New Roman"/>
-          <w:color w:val="FF0000"/>
-          <w:sz w:val="21"/>
-          <w:szCs w:val="21"/>
-          <w:lang w:eastAsia="en-US"/>
-        </w:rPr>
-        <w:t>{{EL_CLIENTE}}</w:t>
+          <w:sz w:val="21"/>
+          <w:szCs w:val="21"/>
+          <w:lang w:eastAsia="en-US"/>
+        </w:rPr>
+        <w:t>EL CLIENTE</w:t>
       </w:r>
       <w:r>
         <w:rPr>
@@ -6799,12 +6928,11 @@
       <w:r>
         <w:rPr>
           <w:rFonts w:ascii="Avenir Book" w:eastAsia="Times New Roman" w:hAnsi="Avenir Book" w:cs="Times New Roman"/>
-          <w:color w:val="FF0000"/>
-          <w:sz w:val="21"/>
-          <w:szCs w:val="21"/>
-          <w:lang w:eastAsia="en-US"/>
-        </w:rPr>
-        <w:t>{{EL_CLIENTE}}</w:t>
+          <w:sz w:val="21"/>
+          <w:szCs w:val="21"/>
+          <w:lang w:eastAsia="en-US"/>
+        </w:rPr>
+        <w:t>EL CLIENTE</w:t>
       </w:r>
       <w:r>
         <w:rPr>
@@ -6869,12 +6997,11 @@
       <w:r>
         <w:rPr>
           <w:rFonts w:ascii="Avenir Book" w:eastAsia="Times New Roman" w:hAnsi="Avenir Book" w:cs="Times New Roman"/>
-          <w:color w:val="FF0000"/>
-          <w:sz w:val="21"/>
-          <w:szCs w:val="21"/>
-          <w:lang w:eastAsia="en-US"/>
-        </w:rPr>
-        <w:t>{{EL_CLIENTE}}</w:t>
+          <w:sz w:val="21"/>
+          <w:szCs w:val="21"/>
+          <w:lang w:eastAsia="en-US"/>
+        </w:rPr>
+        <w:t>EL CLIENTE</w:t>
       </w:r>
       <w:r>
         <w:rPr>
@@ -6939,12 +7066,11 @@
       <w:r>
         <w:rPr>
           <w:rFonts w:ascii="Avenir Book" w:eastAsia="Times New Roman" w:hAnsi="Avenir Book" w:cs="Times New Roman"/>
-          <w:color w:val="FF0000"/>
-          <w:sz w:val="21"/>
-          <w:szCs w:val="21"/>
-          <w:lang w:eastAsia="en-US"/>
-        </w:rPr>
-        <w:t>{{EL_CLIENTE}}</w:t>
+          <w:sz w:val="21"/>
+          <w:szCs w:val="21"/>
+          <w:lang w:eastAsia="en-US"/>
+        </w:rPr>
+        <w:t>EL CLIENTE</w:t>
       </w:r>
       <w:r>
         <w:rPr>
@@ -7009,12 +7135,11 @@
       <w:r>
         <w:rPr>
           <w:rFonts w:ascii="Avenir Book" w:eastAsia="Times New Roman" w:hAnsi="Avenir Book" w:cs="Times New Roman"/>
-          <w:color w:val="FF0000"/>
-          <w:sz w:val="21"/>
-          <w:szCs w:val="21"/>
-          <w:lang w:eastAsia="en-US"/>
-        </w:rPr>
-        <w:t>{{EL_CLIENTE}}</w:t>
+          <w:sz w:val="21"/>
+          <w:szCs w:val="21"/>
+          <w:lang w:eastAsia="en-US"/>
+        </w:rPr>
+        <w:t>EL CLIENTE</w:t>
       </w:r>
       <w:r>
         <w:rPr>
@@ -7766,12 +7891,11 @@
       <w:r>
         <w:rPr>
           <w:rFonts w:ascii="Avenir Book" w:eastAsia="Times New Roman" w:hAnsi="Avenir Book" w:cs="Times New Roman"/>
-          <w:color w:val="FF0000"/>
-          <w:sz w:val="21"/>
-          <w:szCs w:val="21"/>
-          <w:lang w:eastAsia="en-US"/>
-        </w:rPr>
-        <w:t>{{EL_CLIENTE}}</w:t>
+          <w:sz w:val="21"/>
+          <w:szCs w:val="21"/>
+          <w:lang w:eastAsia="en-US"/>
+        </w:rPr>
+        <w:t>EL CLIENTE</w:t>
       </w:r>
       <w:r>
         <w:rPr>
@@ -8051,12 +8175,11 @@
       <w:r>
         <w:rPr>
           <w:rFonts w:ascii="Avenir Book" w:eastAsia="Times New Roman" w:hAnsi="Avenir Book" w:cs="Times New Roman"/>
-          <w:color w:val="FF0000"/>
-          <w:sz w:val="21"/>
-          <w:szCs w:val="21"/>
-          <w:lang w:eastAsia="en-US"/>
-        </w:rPr>
-        <w:t>{{EL_CLIENTE}}</w:t>
+          <w:sz w:val="21"/>
+          <w:szCs w:val="21"/>
+          <w:lang w:eastAsia="en-US"/>
+        </w:rPr>
+        <w:t>EL CLIENTE</w:t>
       </w:r>
       <w:r>
         <w:rPr>
@@ -8176,12 +8299,11 @@
       <w:r>
         <w:rPr>
           <w:rFonts w:ascii="Avenir Book" w:eastAsia="Times New Roman" w:hAnsi="Avenir Book" w:cs="Times New Roman"/>
-          <w:color w:val="FF0000"/>
-          <w:sz w:val="21"/>
-          <w:szCs w:val="21"/>
-          <w:lang w:eastAsia="en-US"/>
-        </w:rPr>
-        <w:t>{{EL_CLIENTE}}</w:t>
+          <w:sz w:val="21"/>
+          <w:szCs w:val="21"/>
+          <w:lang w:eastAsia="en-US"/>
+        </w:rPr>
+        <w:t>EL CLIENTE</w:t>
       </w:r>
       <w:r>
         <w:rPr>
@@ -8238,12 +8360,11 @@
       <w:r>
         <w:rPr>
           <w:rFonts w:ascii="Avenir Book" w:eastAsia="Times New Roman" w:hAnsi="Avenir Book" w:cs="Times New Roman"/>
-          <w:color w:val="FF0000"/>
-          <w:sz w:val="21"/>
-          <w:szCs w:val="21"/>
-          <w:lang w:eastAsia="en-US"/>
-        </w:rPr>
-        <w:t>{{EL_CLIENTE}}</w:t>
+          <w:sz w:val="21"/>
+          <w:szCs w:val="21"/>
+          <w:lang w:eastAsia="en-US"/>
+        </w:rPr>
+        <w:t>EL CLIENTE</w:t>
       </w:r>
       <w:r>
         <w:rPr>
@@ -8325,12 +8446,11 @@
       <w:r>
         <w:rPr>
           <w:rFonts w:ascii="Avenir Book" w:eastAsia="Times New Roman" w:hAnsi="Avenir Book" w:cs="Times New Roman"/>
-          <w:color w:val="FF0000"/>
-          <w:sz w:val="21"/>
-          <w:szCs w:val="21"/>
-          <w:lang w:eastAsia="en-US"/>
-        </w:rPr>
-        <w:t>{{EL_CLIENTE}}</w:t>
+          <w:sz w:val="21"/>
+          <w:szCs w:val="21"/>
+          <w:lang w:eastAsia="en-US"/>
+        </w:rPr>
+        <w:t>EL CLIENTE</w:t>
       </w:r>
       <w:r>
         <w:rPr>
@@ -8362,12 +8482,11 @@
       <w:r>
         <w:rPr>
           <w:rFonts w:ascii="Avenir Book" w:eastAsia="Times New Roman" w:hAnsi="Avenir Book" w:cs="Times New Roman"/>
-          <w:color w:val="FF0000"/>
-          <w:sz w:val="21"/>
-          <w:szCs w:val="21"/>
-          <w:lang w:eastAsia="en-US"/>
-        </w:rPr>
-        <w:t>{{EL_CLIENTE}}</w:t>
+          <w:sz w:val="21"/>
+          <w:szCs w:val="21"/>
+          <w:lang w:eastAsia="en-US"/>
+        </w:rPr>
+        <w:t>EL CLIENTE</w:t>
       </w:r>
       <w:r>
         <w:rPr>
@@ -9121,7 +9240,6 @@
                 <w:rFonts w:ascii="Avenir Book" w:eastAsia="Times New Roman" w:hAnsi="Avenir Book" w:cs="Times New Roman"/>
                 <w:b/>
                 <w:bCs/>
-                <w:color w:val="FF0000"/>
                 <w:sz w:val="21"/>
                 <w:szCs w:val="21"/>
                 <w:lang w:eastAsia="en-US"/>
@@ -9132,7 +9250,6 @@
                 <w:rFonts w:ascii="Avenir Book" w:eastAsia="Times New Roman" w:hAnsi="Avenir Book" w:cs="Times New Roman"/>
                 <w:b/>
                 <w:bCs/>
-                <w:color w:val="FF0000"/>
                 <w:sz w:val="21"/>
                 <w:szCs w:val="21"/>
                 <w:lang w:eastAsia="en-US"/>
@@ -9144,19 +9261,17 @@
                 <w:rFonts w:ascii="Avenir Book" w:eastAsia="Times New Roman" w:hAnsi="Avenir Book" w:cs="Times New Roman"/>
                 <w:b/>
                 <w:bCs/>
-                <w:color w:val="FF0000"/>
                 <w:sz w:val="21"/>
                 <w:szCs w:val="21"/>
                 <w:lang w:eastAsia="en-US"/>
               </w:rPr>
-              <w:t>{{EL_CLIENTE}}</w:t>
+              <w:t>EL CLIENTE</w:t>
             </w:r>
             <w:r>
               <w:rPr>
                 <w:rFonts w:ascii="Avenir Book" w:eastAsia="Times New Roman" w:hAnsi="Avenir Book" w:cs="Times New Roman"/>
                 <w:b/>
                 <w:bCs/>
-                <w:color w:val="FF0000"/>
                 <w:sz w:val="21"/>
                 <w:szCs w:val="21"/>
                 <w:lang w:eastAsia="en-US"/>
@@ -9234,11 +9349,23 @@
                 <w:rFonts w:ascii="Avenir Book" w:eastAsia="Times New Roman" w:hAnsi="Avenir Book" w:cs="Times New Roman"/>
                 <w:b/>
                 <w:bCs/>
+                <w:color w:val="EE0000"/>
                 <w:sz w:val="21"/>
                 <w:szCs w:val="21"/>
                 <w:lang w:eastAsia="en-US"/>
               </w:rPr>
-              <w:t>LUIS ALFONSO CHALITA KAIM.</w:t>
+              <w:t>{{CIUDADANO}}</w:t>
+            </w:r>
+            <w:r>
+              <w:rPr>
+                <w:rFonts w:ascii="Avenir Book" w:eastAsia="Times New Roman" w:hAnsi="Avenir Book" w:cs="Times New Roman"/>
+                <w:b/>
+                <w:bCs/>
+                <w:sz w:val="21"/>
+                <w:szCs w:val="21"/>
+                <w:lang w:eastAsia="en-US"/>
+              </w:rPr>
+              <w:t>.</w:t>
             </w:r>
           </w:p>
           <w:p>

</xml_diff>